<commit_message>
Proofcheck Flour Play Czech: SIGNIFICANT-borderline (31 fixes)
Co-Authored-By: Claude Opus 5.5 <noreply@anthropic.com>
Claude-Session: https://claude.ai/code/session_012Cm8JxdqzjuttdUSdkQCUg
</commit_message>
<xml_diff>
--- a/translated/corrected/Flour Play - ASSEMBLED - FORMATTED_Czech.docx
+++ b/translated/corrected/Flour Play - ASSEMBLED - FORMATTED_Czech.docx
@@ -132,7 +132,7 @@
     <w:p/>
     <w:p>
       <w:r>
-        <w:t xml:space="preserve">Město sahá po těch nejsnadnějších vinících: po řezníkovi, který zablokoval nakládací bránu, po rodině dlužící za topný olej, po znuděném klukovi se zcizenou plechovkou. Jessica však sáhne po tom, co dává smysl – protože ten, kdo to udělal, si ten prášek obstaral, znal dávku a podal stížnost odkazující se na konkrétní pododstavec hygienických předpisů. Tohle nebyl výbuch vzteku. Tohle bylo řemeslo.</w:t>
+        <w:t xml:space="preserve">Město sahá po těch nejsnadnějších vinících: po řezníkovi, který zablokoval nakládací bránu, po rodině dlužící za topný olej, po znuděném klukovi se zcizenou plechovkou. Jessica však sáhne po tom, co dává smysl – protože ten, kdo to udělal, si ten prášek obstaral, znal dávku a podal stížnost odkazující se na konkrétní pododstavec hygienických předpisů. Tohle není výbuch vzteku. Tohle je řemeslo.</w:t>
       </w:r>
     </w:p>
     <w:p/>
@@ -197,7 +197,7 @@
     <w:p/>
     <w:p>
       <w:r>
-        <w:t xml:space="preserve">Dot se zasmála svým krátkým, suchým smíchem z druhého konce kroužku, aniž zvedla zrak od svého věnce, který byl už teď o polovinu větší než kdokoli jiného a dvakrát tak hustý. „Jde po tvé fintě ode dne, kdy jsi sem vkročila. Po té mojí šla v roce devatenáct set osmdesát něco.“ Dot byla statná a šedivá a říkala toho hodně v hodně málo slovech. V tomto obchodě vázala věnce desítky let. Bylo to vidět na jejích rukou. Nikdy se nezastavily a nikdy nezaváhaly.</w:t>
+        <w:t xml:space="preserve">Dot se zasmála svým krátkým, suchým smíchem z druhého konce kroužku, aniž zvedla zrak od svého věnce, který byl už teď o polovinu větší než věnec kohokoli jiného a dvakrát tak hustý. „Jde po tvé fintě ode dne, kdy jsi sem vkročila. Po té mojí šla v roce devatenáct set osmdesát něco.“ Dot byla statná a šedivá a říkala toho hodně v hodně málo slovech. V tomto obchodě vázala věnce desítky let. Bylo to vidět na jejích rukou. Nikdy se nezastavily a nikdy nezaváhaly.</w:t>
       </w:r>
     </w:p>
     <w:p/>
@@ -1040,7 +1040,7 @@
     <w:p/>
     <w:p>
       <w:r>
-        <w:t xml:space="preserve">„Tvoje ruce to nejsou.“ Řekla jsem to ostřeji, než jsem zamýšlela, protože jsem nedokázala snést, že to říká. „Čtyřicet let se nezapomene přes noc a jen tak ve vlastní kuchyni. Tady je v nepořádku něco jiného, co ještě nevidím, a říkám ti, že ty to nejsi.“</w:t>
+        <w:t xml:space="preserve">„Tvoje ruce to nejsou.“ Řekla jsem to ostřeji, než jsem zamýšlela, protože jsem nedokázala snést, že to říká. „Čtyřicet let se nezapomene přes noc, a už vůbec ne jen ve vlastní kuchyni. Tady je v nepořádku něco jiného, co ještě nevidím, a říkám ti, že ty to nejsi.“</w:t>
       </w:r>
     </w:p>
     <w:p/>
@@ -1082,7 +1082,7 @@
     <w:p/>
     <w:p>
       <w:r>
-        <w:t xml:space="preserve">Před pekárnou stál asi tucet lidí a mluvila tlumeným hlasem. Udělali mi místo.</w:t>
+        <w:t xml:space="preserve">Před pekárnou stál asi tucet lidí, kteří mluvili tlumeným hlasem. Udělali mi místo.</w:t>
       </w:r>
     </w:p>
     <w:p/>
@@ -1142,7 +1142,7 @@
     <w:p/>
     <w:p>
       <w:r>
-        <w:t>Odpověď jsem neznala. Měla jsem stejnou otázku a pod ní ještě jednu. Zlonaměrnost by napsala něco osobního, nějakou kletbu nebo jméno. Ten, kdo napsal ŠPINAVÉ, NEBEZPEČNÉ a NEJEZTE TADY, mluvil ke Gretiným zákazníkům a snažil se odlákat obchody z jejího bloku. Bylo to příliš skryté, než abych jí to předkládala v nejhorším dni jejího života, ale byla jsem si tím jistá. Mířilo to přesně tam, kam mělo, a ten, kdo to zamýšlel, něco sledoval.</w:t>
+        <w:t xml:space="preserve">Odpověď jsem neznala. Měla jsem stejnou otázku a pod ní ještě jednu. Zlonaměrnost by napsala něco osobního, nějakou kletbu nebo jméno. Ten, kdo napsal ŠPINAVÉ, NEBEZPEČNÉ a NEJEZTE TADY, mluvil ke Gretiným zákazníkům a snažil se, aby město chodilo nakupovat jinam než do jejího bloku. Bylo to příliš skryté, než abych jí to předkládala v nejhorším dni jejího života, ale byla jsem si tím jistá. Mířilo to přesně tam, kam mělo, a ten, kdo to zamýšlel, něco sledoval.</w:t>
       </w:r>
     </w:p>
     <w:p/>
@@ -2476,7 +2476,7 @@
     </w:p>
     <w:p>
       <w:r>
-        <w:t xml:space="preserve">„Tohle je domov, který tomu stavím, aby si to přestalo půjčovat sněhuláky.“ Unavený, upřímný úsměv. „Ještě to není ono. Celé to potrvá ještě roky. Ale je to začátek, a dokud to nebude hotové, bude to dál pozlacovat svíčky a vodit dětské sněhuláky tmou, protože to chce být tady a nemá vlastní nohy. Bram je bez sebe. Myslí si, že je to nedůstojné, aby magie vyváděla veřejné kousky tam, kde ji město může vidět. Kdyby mohl, zavřel by ji do ohrady k sobům – a udržel by ji tam asi stejně úspěšně jako je.“</w:t>
+        <w:t xml:space="preserve">„Tohle je domov, který tomu stavím, aby si to přestalo půjčovat sněhuláky.“ Unavený, upřímný úsměv. „Ještě to není ono. Celé to potrvá ještě roky. Ale je to začátek, a dokud to nebude hotové, bude to dál pozlacovat svíčky a vodit dětské sněhuláky tmou, protože to chce být tady a nemá vlastní nohy. Bram je bez sebe. Myslí si, že je to nedůstojné, aby magie vyváděla veřejné kousky tam, kde ji město může vidět. Kdyby mohl, zavřel by ji do výběhu k sobům – a udržel by ji tam asi stejně úspěšně jako je.“</w:t>
       </w:r>
     </w:p>
     <w:p>
@@ -2527,12 +2527,12 @@
     <w:p/>
     <w:p>
       <w:r>
-        <w:t xml:space="preserve">Greta dostala své okno zpátky tři dny po cihle, skle i zlatých písmenech, kdy nápis HOLLY JOLLY BAKERY zase v celé šíři zářil nad vchodem díky Tomovi z železářství. Téhož rána otevřela dveře a narazila na takový nával zákazníků, až se jí málem chtělo brečet. Její pece naskočily zpátky tak podivně, jako vypověděly službu. Od incidentu s cihlou zamykala zadní vchod na závoru, ať už v kuchyni panovalo vedro, nebo ne, a každá další várka vyšla sladká jako med. Stála za opravenou vitrínou, poprášená moukou, a zářila na všechny strany. Prodávala zázvorky lidem ve frontě až ven a všem nahlas vykládala, že o téhle sezóně nikdy na vteřinu nepochybovala. Byla to lež. Krásná lež, a všichni na ulici jí ji shovívavě odpustili.</w:t>
-      </w:r>
-    </w:p>
-    <w:p>
-      <w:r>
-        <w:t xml:space="preserve">Byla jsem ve frontě třetí od konce a Pip zkoumala drobky pod vitrínou, když zacinkal zvonek a s chladem dovnitř vešel muž. Ještě než si sundal klobouk, poznala jsem, že je cizí. Úřední kabát, plochá kožená taška v podpaží, výraz člověka, jehož pochůzka nemá nic společného s nákupem. Zastavil se hned za dveřmi a nechal hlučnou frontu kolem sebe utichnout jednoho zákazníka po druhém.</w:t>
+        <w:t xml:space="preserve">Greta dostala výlohu zpátky tři dny po té cihle, sklo i zlatá písmena, a nápis HOLLY JOLLY BAKERY zase v celé šíři zářil nad vchodem díky Tomovi z železářství. Téhož rána otevřela dveře a narazila na takový nával zákazníků, až se jí málem chtělo brečet. Její pece naskočily zpátky tak podivně, jako vypověděly službu. Od incidentu s cihlou zamykala zadní vchod na závoru, ať už v kuchyni panovalo vedro, nebo ne, a každá další várka vyšla sladká jako med. Stála za opravenou vitrínou, poprášená moukou, a zářila na všechny strany. Prodávala zázvorky lidem ve frontě až ven a všem nahlas vykládala, že o téhle sezóně nikdy na vteřinu nepochybovala. Byla to lež. Krásná lež, a všichni na ulici jí ji shovívavě odpustili.</w:t>
+      </w:r>
+    </w:p>
+    <w:p>
+      <w:r>
+        <w:t xml:space="preserve">Byla jsem ve frontě třetí a Pip zkoumala drobky pod vitrínou, když zacinkal zvonek a s chladem dovnitř vešel muž. Ještě než si sundal klobouk, poznala jsem, že je cizí. Úřední kabát, plochá kožená taška v podpaží, výraz člověka, jehož pochůzka nemá nic společného s nákupem. Zastavil se hned za dveřmi a nechal hlučnou frontu kolem sebe utichnout jednoho zákazníka po druhém.</w:t>
       </w:r>
     </w:p>
     <w:p>
@@ -2552,7 +2552,7 @@
     </w:p>
     <w:p>
       <w:r>
-        <w:t>Viděla jsem už hodně tváří, které schytaly nejednu ránu, a viděla jsem, jakou ránu schytala ta Gretina. To světlo nezhaslo rázem. Šířilo se jako mráz po okenní tabulce od okrajů ke středu, takže se celou hrozivou vteřinu na něj dál napůl usmívala tváří, jejíž koutky už prozrazovaly, co se blíží. Fronta za mnou ztichla.</w:t>
+        <w:t xml:space="preserve">Viděla jsem už hodně tváří, které schytaly nejednu ránu, a viděla jsem, jakou ránu schytala ta Gretina. To světlo nezhaslo rázem. Mizelo tak, jak mráz pokrývá okenní tabulku, od okrajů ke středu, takže se celou hrozivou vteřinu na něj dál napůl usmívala tváří, jejíž koutky už prozrazovaly, co se blíží. Fronta za mnou ztichla.</w:t>
       </w:r>
     </w:p>
     <w:p>
@@ -2572,7 +2572,7 @@
     </w:p>
     <w:p>
       <w:r>
-        <w:t>Byl důkladný, byl chladný a já zůstala, protože mě Greta přes mizející obchod střelila pohledem, který o to prosil.</w:t>
+        <w:t xml:space="preserve">Byl důkladný, byl chladný a já zůstala, protože mě Greta přes vyprazdňující se obchod střelila pohledem, který o to prosil.</w:t>
       </w:r>
     </w:p>
     <w:p>
@@ -2632,7 +2632,7 @@
     </w:p>
     <w:p>
       <w:r>
-        <w:t xml:space="preserve">„To nemůžu říct. Ale povím vám jedno, protože mi to vrtá hlavou.“ Kývnul bradou zpátky ke žlutému papíru. „Většinu stížností mi píšou pomatení sousedé nebo přecitlivělí zákazníci, a je to na nich vidět. </w:t>
+        <w:t xml:space="preserve">„To nemůžu říct. Ale povím vám jedno, protože mi to vrtá hlavou.“ Kývnul bradou zpátky ke žlutému papíru. „Většinu stížností mi píšou naštvaní sousedé nebo přecitlivělí zákazníci, a je to na nich vidět. </w:t>
       </w:r>
       <w:r>
         <w:rPr>
@@ -2665,7 +2665,7 @@
         <w:t>Vyrukovalo to s pododstavci.</w:t>
       </w:r>
       <w:r>
-        <w:t xml:space="preserve"> Žádný pomatený soused. Žádný přecitlivělý zákazník. Žádné znuděné dítě s plechovkou barvy, co by na zeď načmáralo ŠPINAVÉ, protože to bylo jediné slovo, které dokázalo napsat. Tohle byla ruka, která znala přesné normy pro teplotu umyvadla a odborný výraz pro mezeru pod dveřmi. Ruka, která dokázala přečíst Gretinu starou, poctivou kuchyni jako seznam úkolů, aniž by do ní kdy vkročila, a věděla přesně, kde se sto let stará budova tenčí. Tohle nebyly znalosti někoho, kdo chléb jen jí. To byly znalosti někoho, kdo ho peče.</w:t>
+        <w:t xml:space="preserve"> Žádný naštvaný soused. Žádný přecitlivělý zákazník. Žádné znuděné dítě s plechovkou barvy, co by na zeď načmáralo ŠPINAVÉ, protože to bylo jediné slovo, které dokázalo napsat. Tohle byla ruka, která znala přesné normy pro teplotu umyvadla a odborný výraz pro mezeru pod dveřmi. Ruka, která dokázala přečíst Gretinu starou, poctivou kuchyni jako seznam úkolů, aniž by do ní kdy vkročila, a věděla přesně, kde se sto let stará budova tenčí. Tohle nebyly znalosti někoho, kdo chléb jen jí. To byly znalosti někoho, kdo ho peče.</w:t>
       </w:r>
     </w:p>
     <w:p>
@@ -3058,7 +3058,7 @@
     </w:p>
     <w:p>
       <w:r>
-        <w:t>Protože to dávalo smysl. Žádný vlhký sklad. Žádná smůla. Koupený prášek s obchodním názvem, vmíchaný do její mouky rukou, která znala dávku na chlup přesně, schovaný v pytli a projevující se teprve na jazyku, až po upečení. Stála jsem tam na doktorových schodech a skládala stará fakta za sebe do řady, stejně jako u Frostyho, jenže teď to bylo mnohem osobnější a tvrdší.</w:t>
+        <w:t xml:space="preserve">Protože to dávalo smysl. Žádný vlhký sklad. Žádná smůla. Koupený prášek s obchodním názvem, vmíchaný do její mouky rukou, která znala dávku na chlup přesně, schovaný v pytli a projevující se teprve na jazyku, až po upečení. Stála jsem tam na doktorových schodech a skládala stará fakta za sebe do řady, stejně jako u Frostyho, jenže teď těsněji a neúprosněji.</w:t>
       </w:r>
     </w:p>
     <w:p>
@@ -3113,7 +3113,7 @@
     </w:p>
     <w:p>
       <w:r>
-        <w:t>Nechala jsem sněhuláka jeho dlouhému, trpělivému hlídání uličky a šla domů se sklenicí těžkou v kabátu, s tou jedinou pádnou věcí, kterou jsem měla a která ukazovala někam ke správnému směru.</w:t>
+        <w:t xml:space="preserve">Nechala jsem sněhuláka jeho dlouhému, trpělivému hlídání uličky a šla domů se sklenicí těžkou v kabátu, s tou jedinou pádnou věcí, kterou jsem měla a která vůbec někam ukazovala.</w:t>
       </w:r>
     </w:p>
     <w:p>
@@ -3405,7 +3405,7 @@
     <w:p/>
     <w:p>
       <w:r>
-        <w:t>„Nebudu vás zdržovat od práce,“ řekla jsem. „Přišla jsem vám říct, že jsem vás měla na seznamu. Kvůli Gretiným potížím. S ohledem na prostý fakt, že jste v té uličce před rozedněním a nikdo jiný tam nemá co pohledávat.“ Přišlo mi nejlepší vyložit člověku tu ošklivou věc rovnou celou a nechat ho, ať se na ni podívá. „A taky jsem vám přišla říct, že jsem vás z toho seznamu zase škrtla. Cokoliv za tímhle stojí, to vyžadovalo povahu pro tmu a pekařské řemeslo na ten prášek, a vy nemáte ani jedno. Hádáte se v poledne a porcujete maso. K vám to nesedí.“</w:t>
+        <w:t xml:space="preserve">„Nebudu vás zdržovat od práce,“ řekla jsem. „Přišla jsem vám říct, že jsem vás měla na seznamu. Kvůli Gretiným potížím. S ohledem na prostý fakt, že jste na tom dvoře před rozedněním a nikdo jiný tam nemá co pohledávat.“ Přišlo mi nejlepší vyložit člověku tu ošklivou věc rovnou celou a nechat ho, ať se na ni podívá. „A taky jsem vám přišla říct, že jsem vás z toho seznamu zase škrtla. Cokoliv za tímhle stojí, to vyžadovalo povahu pro tmu a pekařské řemeslo na ten prášek, a vy nemáte ani jedno. Hádáte se v poledne a porcujete maso. K vám to nesedí.“</w:t>
       </w:r>
     </w:p>
     <w:p/>
@@ -4192,7 +4192,7 @@
     </w:p>
     <w:p>
       <w:r>
-        <w:t xml:space="preserve">Na věnci jsem se rozhodla už za tmy, zatímco Nick spal – byl to jediná záminka, s níž projdu jejím zlatým vchodem bez falešného tónu – protože tahle záminka falešná nebyla. Ženy z kroužku vyzdobily na svátky celou třídu, dveře každého obchodu, a nový obchod znamenal nové dveře. Nenabídnout Sugarplum věneček v týdnu, kdy měla otevřít, by bylo nápadné. Takže až budu mít ruce v chvojí, udělám i to druhé, kvůli čemu jsem tam šla. Prohlédnu si ji zblízka. Dost blízko na to, abych zachytila, co se skrývá pod tím kouzlem. Stejně to bylo i s Petem a jeho špalíkem.</w:t>
+        <w:t xml:space="preserve">Na věnci jsem se rozhodla už za tmy, zatímco Nick spal – byla to jediná záminka, s níž projdu jejím zlatým vchodem bez falešného tónu – protože tahle záminka falešná nebyla. Ženy z kroužku vyzdobily na svátky celou třídu, dveře každého obchodu, a nový obchod znamenal nové dveře. Nenabídnout Sugarplum věneček v týdnu, kdy měla otevřít, by bylo nápadné. Takže až budu mít ruce v chvojí, udělám i to druhé, kvůli čemu jsem tam šla. Prohlédnu si ji zblízka. Dost blízko na to, abych zachytila, co se skrývá pod tím kouzlem. Stejně to bylo i s Petem a jeho špalíkem.</w:t>
       </w:r>
     </w:p>
     <w:p>
@@ -4297,7 +4297,7 @@
     </w:p>
     <w:p>
       <w:r>
-        <w:t xml:space="preserve">A na základě dostupných důkazů by měli pravdu. Znát spáry ještě neznamená sypat prášek. Dala mi jistotu a nic, s čím by se dalo něco dělat, a já si uvědomovala, že pod tím vším soucitem přesně ví, jak málo toho z jejího obchodu si odnesu s sebou.</w:t>
+        <w:t xml:space="preserve">A na základě dostupných důkazů by měli pravdu. Znát spáry ještě neznamená sypat prášek. Nechala mě to poznat, ale nedala mi nic, s čím by se dalo něco dělat, a já si uvědomovala, že pod tím vším soucitem přesně ví, jak málo toho z jejího obchodu si odnesu s sebou.</w:t>
       </w:r>
     </w:p>
     <w:p>
@@ -4343,7 +4343,7 @@
     <w:p/>
     <w:p>
       <w:r>
-        <w:t xml:space="preserve">Věnec pro Sugarplum ležel na mém kuchyňském stole v polovině vázání, jedle byla omotaná do třetiny kruhu a drát visel z kostry, zatímco zlatá stuha, kterou jsem ustřihla na mašli, čekala vedle. Dělala jsem na něm už hodinu od chvíle, kdy jsem se vrátila z jejího obchodu, a u každé snítky jsem myslela na ty spáry. Pak jsem si znovu oblékla kabát. Před dvěma dny na lavičce na návsi sáhl Danny Ott po vzpomínce, kterou nemohl tak docela chytit, a já mu řekla, ať si pro ni přijde, až se mu to rozleží v hlavě. Nechtělo se mi na něj dál čekat.</w:t>
+        <w:t xml:space="preserve">Věnec pro Sugarplum ležel na mém kuchyňském stole v polovině vázání, jedle byla omotaná do třetiny kruhu a drát visel z kostry, zatímco zlatá stuha, kterou jsem ustřihla na mašli, čekala vedle. Dělala jsem na něm už hodinu od chvíle, kdy jsem se vrátila z jejího obchodu, a u každé snítky jsem myslela na ty spáry. Pak jsem si znovu oblékla kabát. Před dvěma dny na lavičce na návsi sáhl Danny Ott po vzpomínce, kterou nemohl tak docela chytit, a já mu řekla, ať s ní za mnou přijde, až se mu to vyjasní. Nechtělo se mi na něj dál čekat.</w:t>
       </w:r>
     </w:p>
     <w:p/>
@@ -4649,7 +4649,7 @@
     <w:p/>
     <w:p>
       <w:r>
-        <w:t>„Do croissantu se přece kvas nestrká, doktore,“ prohodila Renée.</w:t>
+        <w:t xml:space="preserve">„Do croissantu se přece nic kyselého nedává, doktore,“ prohodila Renée.</w:t>
       </w:r>
     </w:p>
     <w:p/>
@@ -4828,7 +4828,7 @@
     <w:p/>
     <w:p>
       <w:r>
-        <w:t xml:space="preserve">„Ferris chtěl zaplatit nový kotel,“ pronesl Hal tichým hlasem, ani ne tak ke mně jako do prázdna. „Celou částku, pokud město zaplatí střechu. Tak to bylo domluvené. Jenže teď je pryč i střecha a střecha stojí dvakrát tolik, a Ferris sice v dobrém roce zaplatí kotel, ale v tom špatném každou minci dvakrát obrátí.“ Promnul si obličej. „Rovnou ne neřekne. Řekne, ať počkáme do jara. Dokud neuvidíme. Do jara mráz projde celým stropem. Jde teď o sbírku, Jessico. O budovu a o všechno v ní.“</w:t>
+        <w:t xml:space="preserve">„Ferris chtěl zaplatit nový kotel,“ pronesl Hal tichým hlasem, ani ne tak ke mně jako do prázdna. „Celou částku, pokud město zaplatí střechu. Tak to bylo domluvené. Jenže teď je pryč i střecha a střecha stojí o polovinu víc, a Ferris sice v dobrém roce zaplatí kotel, ale v tom špatném každou minci dvakrát obrátí.“ Promnul si obličej. „Rovnou ne neřekne. Řekne, ať počkáme do jara. Dokud neuvidíme. Do jara mráz projde celým stropem. Jde teď o sbírku, Jessico. O budovu a o všechno v ní.“</w:t>
       </w:r>
     </w:p>
     <w:p/>
@@ -5178,7 +5178,7 @@
     </w:p>
     <w:p>
       <w:r>
-        <w:t xml:space="preserve">„V to jsem věřila. Pak se doktor ve čtvrtek podíval do jejího skladu a nebylo tam ani zrnko kyselého základu a ona mi řekla, kdo jí vykládal o Gretiných spárách.“ Dál už jsem nešla, když jsem na tenhle večer zapřísáhla žádné tváře. „Takže mi zbývá papír. Leták je důkazem na něčím pultu ještě dlouho předtím, než se objeví na nástěnce. Někdo ho tam viděl. Někdo si z něj ten týden přečetl a napsal na okres stížnost, aby do něj spadla.“</w:t>
+        <w:t xml:space="preserve">„V to jsem věřila. Pak se doktor ve čtvrtek podíval do jejího skladu a nebylo tam ani zrnko kyselého základu a ona mi řekla, kdo jí vykládal o Gretiných spárách.“ Dál už jsem nešla, když jsem na tenhle večer zapřísáhla žádné tváře. „Takže mi zbývá papír. Leták leží v korektuře na něčím pultu ještě dlouho předtím, než se objeví na nástěnce. Někdo ho tam viděl. Někdo si z něj ten týden přečetl a napsal na okres stížnost, aby do něj spadla.“</w:t>
       </w:r>
     </w:p>
     <w:p>
@@ -5218,7 +5218,7 @@
     </w:p>
     <w:p>
       <w:r>
-        <w:t xml:space="preserve">„Jessiko. Výborně,“ řekla Olivia. „Pojď Marthě vysvětlit, že se nezbláznila.“</w:t>
+        <w:t xml:space="preserve">„Jessico. Výborně,“ řekla Olivia. „Pojď Marthě vysvětlit, že se nezbláznila.“</w:t>
       </w:r>
     </w:p>
     <w:p>
@@ -5393,7 +5393,7 @@
     </w:p>
     <w:p>
       <w:r>
-        <w:t xml:space="preserve">„Od Joyce tak nikdo neříkal.“ Mluvila k té knize. „Je to chladicí box. Odjakživa to byl chladicí box pro Harolda, pro závozníky, pro každého, kdo u mě kdy pracoval. Joyce tomu říkala chladírna. Říkávala: Jdu do chladírny, Greto, nenech housky připálit, jako by to byla nějaká místnost v domě. A to umyvadlo u zadních dveří. Starý mixér Hobart stál vedle něj léta, dokud neodešel motor, takže mu říkala hobartský dřez, a to jméno jí zůstalo a nikomu jinému ne.“ Ústa se jí zkřivila. „Když odešla, přestala jsem používat obojí. Nemohla jsem to slovo slyšet vlastním hlasem. Říkala jsem chladicí box. Donutila jsem se k tomu.“</w:t>
+        <w:t xml:space="preserve">„Od Joyce tak nikdo neříkal.“ Mluvila k té knize. „Je to chladicí box. Odjakživa to byl chladicí box pro Harolda, pro závozníky, pro každého, kdo u mě kdy pracoval. Joyce tomu říkala chladírna. Říkávala: Jdu do chladírny, Greto, nenech housky připálit, jako by to byla nějaká místnost v domě. A to umyvadlo u zadních dveří. Starý mixér Hobart stál vedle něj léta, dokud neodešel motor, takže mu říkala hobartský dřez, a to jméno jí zůstalo a nikomu jinému ne.“ Ústa se jí zkřivila. „Když odešla, přestala jsem používat obojí. Nemohla jsem ta slova slyšet vlastním hlasem. Říkala jsem chladicí box. Donutila jsem se k tomu.“</w:t>
       </w:r>
     </w:p>
     <w:p>
@@ -5811,7 +5811,7 @@
     </w:p>
     <w:p>
       <w:r>
-        <w:t xml:space="preserve">„To je ono,“ prohlásil doktor. „Kyselina mléčná a octová na moučném základu, pořádně nadávkované. Nemůžu vám zaručit, že to vypadlo zrovna z toho pytle. Státní laboratoř bude mít přesnější výsledky než tenhle můj stůl. Ale všechno v téhle sklenici odpovídá tomuto listu.“</w:t>
+        <w:t xml:space="preserve">„To je ono,“ prohlásil doktor. „Kyselina mléčná a octová na moučném nosiči, pořádně nadávkované. Nemůžu vám zaručit, že to vypadlo zrovna z toho pytle. Státní laboratoř bude mít přesnější výsledky než tenhle můj stůl. Ale všechno v téhle sklenici odpovídá tomuto listu.“</w:t>
       </w:r>
     </w:p>
     <w:p>
@@ -5902,7 +5902,7 @@
     </w:p>
     <w:p>
       <w:r>
-        <w:t xml:space="preserve">„Jessiko,“ řekla Tanaková. „Sedni si.“</w:t>
+        <w:t xml:space="preserve">„Jessico,“ řekla Tanaková. „Sedni si.“</w:t>
       </w:r>
     </w:p>
     <w:p>
@@ -5987,7 +5987,7 @@
     </w:p>
     <w:p>
       <w:r>
-        <w:t xml:space="preserve">„Myslím, že z kontejneru za Sugarplum, stejně jako tu cihlu. Kdokoli v bloku do ní může sáhnout.“ Řekla jsem tu další část přímo, protože se to tak slušelo a protože ve čtvrtek bych to neudělala. „Renée Duvalová s tím vším neměla nic společného.“</w:t>
+        <w:t xml:space="preserve">„Myslím, že z kontejneru za Sugarplum, stejně jako tu cihlu. Kdokoli v bloku do něj může sáhnout.“ Řekla jsem tu další část přímo, protože se to tak slušelo a protože ve čtvrtek bych to neudělala. „Renée Duvalová s tím vším neměla nic společného.“</w:t>
       </w:r>
     </w:p>
     <w:p>
@@ -6314,7 +6314,7 @@
     <w:p/>
     <w:p>
       <w:r>
-        <w:t>„Pětadvacet let,“ řekla Gretě. „Ty jsi to nikdy nevyměnila. Bože, Gret.“</w:t>
+        <w:t xml:space="preserve">„Pětadvacet let,“ řekla Gretě. „Ten zámek jsi nikdy nevyměnila. Bože, Gret.“</w:t>
       </w:r>
     </w:p>
     <w:p/>
@@ -6494,7 +6494,7 @@
     <w:p/>
     <w:p>
       <w:r>
-        <w:t xml:space="preserve">Joyce se na ni na okamžik podívala. Pak zvedla svazek, aniž se podívala, našla správný klíč a nehtem palce ho stáhla dolů. Byl to malý mosazný klíč, v ramínkách hladce ošoupaný. Položila ho na stůl před Gretu, ne před Tanakovou.</w:t>
+        <w:t xml:space="preserve">Joyce se na ni na okamžik podívala. Pak zvedla svazek, naslepo na něm našla ten správný klíč a nehtem palce ho stáhla dolů. Byl to malý mosazný klíč, v ramínkách hladce ošoupaný. Položila ho na stůl před Gretu, ne před Tanakovou.</w:t>
       </w:r>
     </w:p>
     <w:p/>
@@ -6548,7 +6548,7 @@
     </w:p>
     <w:p>
       <w:r>
-        <w:t xml:space="preserve">Bylo to vyřízené v tichosti, jak předeslala. Žádný sál. Žádný dav. Moji sklenici s moukou si z doktorovy uzamčené skříňky přinesla sama, s jeho podepsaným lístkem hned vedle, Dannyho vzala stranou s veškerou šetrností a každý krok si průběžně zapisovala.</w:t>
+        <w:t xml:space="preserve">Bylo to vyřízené v tichosti, jak předeslala. Žádný sál. Žádný dav. Moji sklenici s moukou si z doktorovy uzamčené skříňky přinesla sama, s jeho podepsaným lístkem hned vedle, Dannyho výpověď si s veškerou šetrností vyslechla stranou a každý krok si průběžně zapisovala.</w:t>
       </w:r>
     </w:p>
     <w:p>
@@ -6697,7 +6697,7 @@
     </w:p>
     <w:p>
       <w:r>
-        <w:t xml:space="preserve">„Náčelnice se včera stavila pro mé prohlášení.“ Položila hadřík na mramorovou desku. „Jak jsem pochopila, ta cihla pocházela z mého kontejneru úmyslně. Že si někdo dal tu práci, aby můj obchod vypadal jako místo, kde by se něco takového stalo.“ Podívala se na mě rovným pohledem. „Děkuji, že jste mi to přišla říct. Chtěla jste ještě něco?“</w:t>
+        <w:t xml:space="preserve">„Náčelnice se včera stavila pro mé prohlášení.“ Položila hadřík na mramorovou desku. „Jak jsem pochopila, ta cihla pocházela z mého kontejneru úmyslně. Že si někdo dal tu práci, aby můj obchod vypadal jako obchod, který by něco takového udělal.“ Podívala se na mě rovným pohledem. „Děkuji, že jste mi to přišla říct. Chtěla jste ještě něco?“</w:t>
       </w:r>
     </w:p>
     <w:p>
@@ -6737,7 +6737,7 @@
     </w:p>
     <w:p>
       <w:r>
-        <w:t xml:space="preserve">„Theo se k tomu přiznal, jakmile na něj přišli,“ řekla jsem. „Joyce se do toho trochu vložila až úplně nakonec, kdy už to nic nemohlo změnit.“ Napila jsem se. „Nemocnice s ní ukončila spolupráci. Penziony taky.“</w:t>
+        <w:t xml:space="preserve">„Theo se k tomu přiznal, jakmile na něj přišli,“ řekla jsem. „Joyce k tomu trochu dospěla až úplně nakonec, kdy už to nic nemohlo změnit.“ Napila jsem se. „Nemocnice s ní ukončila spolupráci. Penziony taky.“</w:t>
       </w:r>
     </w:p>
     <w:p>

</xml_diff>

<commit_message>
Full proofcheck Flour Play Czech: SIGNIFICANT (63 fixes)
Co-Authored-By: Claude Opus 5.5 <noreply@anthropic.com>
Claude-Session: https://claude.ai/code/session_012Cm8JxdqzjuttdUSdkQCUg
</commit_message>
<xml_diff>
--- a/translated/corrected/Flour Play - ASSEMBLED - FORMATTED_Czech.docx
+++ b/translated/corrected/Flour Play - ASSEMBLED - FORMATTED_Czech.docx
@@ -299,7 +299,7 @@
     <w:p/>
     <w:p>
       <w:r>
-        <w:t xml:space="preserve">Pak jsme se do toho pustily naplno, osm žen, krabice košíčků, tučňák a spící pes. Hovory plynuly dovnitř a ven z práce, jak už to v kroužku chodí, drobná dopolední novinka vměstnaná do prostor mezi vázáním snítek. Dceři Ivy dali novou práci v Concordu. Claire měla ve čtvrtek vyjít článek o harmonogramu pluhů, o kterém nám věrně slibovala, že je zajímavější, než zní. Martha říkala, že dny se teď zkracují tak rychle, že Emma chodí venčit Snowballa téměř za tmy, a já řekla, vyřiď dítěti moje pozdravy. Martha odvětila, že se Emma pořád ptá na Pip. A Pip, když uslyšela své jméno a správně si ho vyložila jako chválu, načepýřila peří a zatvářila se spokojeně.</w:t>
+        <w:t xml:space="preserve">Pak jsme se do toho pustily naplno, osm žen, krabice košíčků, tučňák a spící pes. Hovory plynuly dovnitř a ven z práce, jak už to v kroužku chodí, drobné novinky celého dopoledne vměstnané do mezer mezi vázáním snítek. Dceři Ivy dali novou práci v Concordu. Claire měla ve čtvrtek vyjít článek o harmonogramu pluhů, o kterém nám věrně slibovala, že je zajímavější, než zní. Martha říkala, že dny se teď zkracují tak rychle, že Emma chodí venčit Snowballa téměř za tmy, a já řekla, vyřiď dítěti moje pozdravy. Martha odvětila, že se Emma pořád ptá na Pip. A Pip, když uslyšela své jméno a správně si ho vyložila jako chválu, načepýřila peří a zatvářila se spokojeně.</w:t>
       </w:r>
     </w:p>
     <w:p/>
@@ -371,7 +371,7 @@
     <w:p/>
     <w:p>
       <w:r>
-        <w:t>Toho rána byl ten prostřední otočený úplně dokola.</w:t>
+        <w:t>Toho rána byl ten prostřední otočený čelem vzad.</w:t>
       </w:r>
     </w:p>
     <w:p/>
@@ -550,7 +550,7 @@
     <w:p/>
     <w:p>
       <w:r>
-        <w:t>„Včerejší poledne. Vyšel první špatný plech a já si říkala, no tak, Greto, byla jsi nepozorná, každý se občas utne. Vyhodila jsem ho a začala znovu, a stalo se to znova. Od té doby se točím v kruhu, zatímco objednávky na Den díkůvzdání se v té knize jen hrnou.“</w:t>
+        <w:t>„Včerejší poledne. Vyšel první špatný plech a já si říkala, no tak, Greto, byla jsi nepozorná, každý se občas utne. Vyhodila jsem ho a začala znovu, a stalo se to znova. Od té doby se točím v kruhu, zatímco objednávky na Den díkůvzdání čekají v té knize.“</w:t>
       </w:r>
     </w:p>
     <w:p/>
@@ -689,7 +689,7 @@
     </w:p>
     <w:p>
       <w:r>
-        <w:t xml:space="preserve">„No, budeš chtít.“ Otřela pult, který to vůbec nepotřeboval. „Cukrárnu, Jessico. Ne pekařství. Cukrárnu. Je v tom rozdíl, jak jsem se nechala poučit, a předpokládám, že nám to všichni budou muset brzy vysvětlit znova.“ Řekla to lehce, ale neusmála se.</w:t>
+        <w:t xml:space="preserve">„No, budeš chtít.“ Otřela pult, který to vůbec nepotřeboval. „Cukrárnu, Jessico. Ne pekařství. Cukrárnu. Je v tom rozdíl, jak jsem se nechala poučit, a předpokládám, že nám to ještě všem vysvětlí znova.“ Řekla to lehce, ale neusmála se.</w:t>
       </w:r>
     </w:p>
     <w:p>
@@ -829,7 +829,7 @@
     </w:p>
     <w:p>
       <w:r>
-        <w:t xml:space="preserve">Přes to všechno jsem se necítila ve své kůži. Pod tím vřelým povrchem byla chladná a precizní. Přivítala mě, nakrmila mě, a jedním dechem, aniž bych o to žádala, zasela malou, pečlivě opečovávanou pochybnost o jediné pekařce na třídě, jehož celý rok závisel na nadcházejících šesti týdnech. Udělala to tak jemně, s takovou účastí, že každý, kdo by nedával pozor, by jí ještě poděkoval za starost.</w:t>
+        <w:t xml:space="preserve">Přes to všechno jsem se necítila ve své kůži. Pod tím vřelým povrchem byla chladná a precizní. Přivítala mě, nakrmila mě, a jedním dechem, aniž bych o to žádala, zasela malou, pečlivě opečovávanou pochybnost o jediné pekařce na třídě, jejíž celý rok závisel na nadcházejících šesti týdnech. Udělala to tak jemně, s takovou účastí, že každý, kdo by nedával pozor, by jí ještě poděkoval za starost.</w:t>
       </w:r>
     </w:p>
     <w:p>
@@ -998,7 +998,7 @@
     <w:p/>
     <w:p>
       <w:r>
-        <w:t>Druhý den ráno jsem se vrátila do Holly Jolly a našla Gretu při práci, přestože jsem jí přikázala odpočívat. Průčelí měla kompletně předělané. Podlaha se blýskala vytřená a vitríny byly otřené a prázdné. Greta byla až po lokty v novém těstě, protože se rozhodla zkusit pec ještě jednou.</w:t>
+        <w:t>Druhý den ráno jsem se vrátila do Holly Jolly a našla Gretu při práci, přestože jsem jí přikázala odpočívat. Přední část krámu měla celou uklizenou. Podlaha se blýskala vytřená a vitríny byly otřené a prázdné. Greta byla až po lokty v novém těstě, protože se rozhodla zkusit pec ještě jednou.</w:t>
       </w:r>
     </w:p>
     <w:p/>
@@ -1142,7 +1142,7 @@
     <w:p/>
     <w:p>
       <w:r>
-        <w:t xml:space="preserve">Odpověď jsem neznala. Měla jsem stejnou otázku a pod ní ještě jednu. Zlonaměrnost by napsala něco osobního, nějakou kletbu nebo jméno. Ten, kdo napsal ŠPINAVÉ, NEBEZPEČNÉ a NEJEZTE TADY, mluvil ke Gretiným zákazníkům a snažil se, aby město chodilo nakupovat jinam než do jejího bloku. Bylo to příliš skryté, než abych jí to předkládala v nejhorším dni jejího života, ale byla jsem si tím jistá. Mířilo to přesně tam, kam mělo, a ten, kdo to zamýšlel, něco sledoval.</w:t>
+        <w:t xml:space="preserve">Odpověď jsem neznala. Měla jsem stejnou otázku a pod ní ještě jednu. Zlonaměrnost by napsala něco osobního, nějakou kletbu nebo jméno. Ten, kdo napsal ŠPINAVÉ, NEBEZPEČNÉ a NEJEZTE TADY, mluvil ke Gretiným zákazníkům a snažil se, aby město chodilo nakupovat jinam než do jejího bloku. Bylo to ještě příliš nejasné, než abych jí to předkládala v nejhorším dni jejího života, ale byla jsem si tím jistá. Mířilo to přesně tam, kam mělo, a ten, kdo to zamýšlel, něco sledoval.</w:t>
       </w:r>
     </w:p>
     <w:p/>
@@ -1226,7 +1226,7 @@
     <w:p/>
     <w:p>
       <w:r>
-        <w:t xml:space="preserve">„Zatím nevím nic,“ řekla jsem, což byla pravda a říkalo se mi to těžko. „Ale udělám tohle, a můžeš mě za to vzít za slovo. Přijdu tomu na kloub. Ne koho bych si přála, a ne to, co je nejsnazší, ale celou pravdu odshora až dolů. Někdo ti to udělal schválně.“ Vzala jsem její studenou ruku do obou svých. „Hlavu vzhůru, nech si od lidí pomoct a zbytek nech na mně. Někdo chce, aby Frost Falls přestalo důvěřovat Holly Jolly. Zjistím proč, a pak kdo, a pak jim zařídíme, že jich bude zatraceně mrzet, že si vybrali pro svůj boj moji ulici.“</w:t>
+        <w:t xml:space="preserve">„Zatím nevím nic,“ řekla jsem, což byla pravda a říkalo se mi to těžko. „Ale udělám tohle, a můžeš mě za to vzít za slovo. Přijdu tomu na kloub. Ne koho bych si přála, a ne to, co je nejsnazší, ale celou pravdu odshora až dolů. Někdo ti to udělal schválně.“ Vzala jsem její studenou ruku do obou svých. „Hlavu vzhůru, nech si od lidí pomoct a zbytek nech na mně. Někdo chce, aby Frost Falls přestalo důvěřovat Holly Jolly. Zjistím proč, a pak kdo, a pak jim zařídíme, že je bude zatraceně mrzet, že si vybrali pro svůj boj moji ulici.“</w:t>
       </w:r>
     </w:p>
     <w:p/>
@@ -1394,7 +1394,7 @@
     <w:p/>
     <w:p>
       <w:r>
-        <w:t>Zůstala asi hodinu, dokud Tom nedostal většinu červené barvy z palubek a kroužek se nezačal rozcházet ke svým ranním povinnostem, pak si zapnula parky přes bílý plášť a vyšla ke své dodávce. Doběhla jsem ji u chodníku.</w:t>
+        <w:t>Zůstala asi hodinu, dokud Tom nedostal většinu červené barvy z palubek a kroužek se nezačal rozcházet ke svým ranním povinnostem, pak si zapnula parku přes bílý plášť a vyšla ke své dodávce. Doběhla jsem ji u chodníku.</w:t>
       </w:r>
     </w:p>
     <w:p/>
@@ -1447,7 +1447,7 @@
     <w:p/>
     <w:p>
       <w:r>
-        <w:t>Poznala jsem to v téže vteřině, kdy jsem vešla a dupnutím oklepala sníh. Všech šest jich bylo skloněných nad rámy jako předtím, s jedlovým chvojím a tou samou sklenicí zlacených šišek, ale v obchodě panovalo jiné ticho než obvykle. Bylo to ono ticho žen, které mluvily o vážných věcech a měly v tom pokračovat hned, jak se přestanou hýbat dveře. Olivia vzhlédla od svého křesla v čele kroužku. „Sedni si, Jessiko. Jsme z toho všechny nešťastné.“</w:t>
+        <w:t>Poznala jsem to v téže vteřině, kdy jsem vešla a dupnutím oklepala sníh. Všech šest jich bylo skloněných nad rámy jako předtím, s jedlovým chvojím a tou samou sklenicí zlacených šišek, ale v obchodě panovalo jiné ticho než obvykle. Bylo to ono ticho žen, které mluvily o vážných věcech a měly v tom pokračovat hned, jak se přestanou hýbat dveře. Olivia vzhlédla od svého křesla v čele kroužku. „Sedni si, Jessico. Jsme z toho všechny nešťastné.“</w:t>
       </w:r>
     </w:p>
     <w:p/>
@@ -1627,7 +1627,7 @@
     <w:p/>
     <w:p>
       <w:r>
-        <w:t xml:space="preserve">„To se mi hnusí,“ ozvala se tiše Ivy. „To se mi hnusí nejvíc ze všeho. Všechny moc dobře víme, jaké rodiny prožívají těžký listopad. Hal neplní sudy jen tak pro nic za nic. A je to kruté, podívat se na souseda, který klepe kosu a dluží za topný olej, a pomyslet si: tady je ten, kdo hází cihly.“</w:t>
+        <w:t xml:space="preserve">„To se mi hnusí,“ ozvala se tiše Ivy. „To se mi hnusí nejvíc ze všeho. Všechny moc dobře víme, že některé rodiny prožívají těžký listopad. Hal neplní sudy jen tak pro nic za nic. A je to kruté, podívat se na souseda, který klepe kosu a dluží za topný olej, a pomyslet si: tady je ten, kdo hází cihly.“</w:t>
       </w:r>
     </w:p>
     <w:p/>
@@ -1639,7 +1639,7 @@
     <w:p/>
     <w:p>
       <w:r>
-        <w:t>„Nezáleží a nepustím,“ řekla Ellie tiše a s úlevou, jako by jen čekala, až jí někdo řekne, že to břemeno nemusí nést sama. „Chtěla jsem to jen slyšet nahlas, abychom se všechny shodly na tom, že se za to stydíme.“</w:t>
+        <w:t>„Nedostane se to ven a já to nepustím,“ řekla Ellie tiše a s úlevou, jako by jen čekala, až jí někdo řekne, že to břemeno nemusí nést sama. „Chtěla jsem to jen slyšet nahlas, abychom se všechny shodly na tom, že se za to stydíme.“</w:t>
       </w:r>
     </w:p>
     <w:p/>
@@ -1992,7 +1992,7 @@
     <w:p/>
     <w:p>
       <w:r>
-        <w:t xml:space="preserve">Claire o tom věděla do večeře. O dva dny později se v Gazetě objevila fotografie té kresby, z obou stran, se strnulými malovanými zakladateli i jemným hnědým rukopisem. Titulek hlásal SLOVA SAMOTNÉ ZAKLADATELKY a pod ním menším písmem: </w:t>
+        <w:t xml:space="preserve">Claire o tom věděla do večeře. O dva dny později se v Gazetě objevila fotografie té kresby, z obou stran, se strnulými tužkou kreslenými zakladateli i jemným hnědým rukopisem. Titulek hlásal SLOVA SAMOTNÉ ZAKLADATELKY a pod ním menším písmem: </w:t>
       </w:r>
       <w:r>
         <w:rPr>
@@ -2001,7 +2001,7 @@
         <w:t>Frost Falls nepostavili silní. Postavili ho sousedé.</w:t>
       </w:r>
       <w:r>
-        <w:t xml:space="preserve"> Lidé si to vystřihovali. Kelly si ten výstřižek přilepila za pultem u pokladny, kde si ho každý, kdo si koupil kávu, přečetl – většinou nahlas – a na chvíli ztichl. Greta, když jsem jí ten ústřižek přinesla do jejího uzavřeného obchodu, si ho přečetla dvakrát, úplně stejně jako já. Pevně stiskla rty. „No ne,“ utrousila. Jen to, tónem ženy, které něco připomněli přesně v hodinu, kdy to nejvíc potřebovala slyšet. Potom si ho přilepila zevnitř na tmavé okno směrem do ulice. Zrovna tam, kde předtím z prken smyli nápis ŠPINAVÉ.</w:t>
+        <w:t xml:space="preserve"> Lidé si to vystřihovali. Kelly si ten výstřižek přilepila za pultem u pokladny, kde si ho každý, kdo si koupil kávu, přečetl – většinou nahlas – a na chvíli ztichl. Greta, když jsem jí ten ústřižek přinesla do jejího uzavřeného obchodu, si ho přečetla dvakrát, úplně stejně jako já. Pevně stiskla rty. „No ne,“ utrousila. Jen to, tónem ženy, které něco připomněli přesně v hodinu, kdy to nejvíc potřebovala slyšet. Potom si ho přilepila zevnitř na tmavé okno směrem do ulice. Zrovna tam, kde předtím z palubek smyli nápis ŠPINAVÉ.</w:t>
       </w:r>
     </w:p>
     <w:p/>
@@ -2040,13 +2040,13 @@
     <w:p/>
     <w:p>
       <w:r>
-        <w:t xml:space="preserve">„Postav sud,“ řekla jsem. „Já pro něj něco upeču a přitáhnu Nicka, aby ho odnesl. A vsadím se, že Greta taky něco upeče, jakmile se jí vrátí trouby, protože na téhle ulici není jediná duše, která by si její jméno nechala v okně a nenašla by pro ni pak pochopení.“ Složila jsem jeho papír úhledně podle záhybu, jak to měl rád, a vrátila mu ho. „Společnost je pořád v maléru, Hale. Nenech se tou vlnou dobroty oklamat. Slovem zakladatelky kotel neopravíš.“</w:t>
-      </w:r>
-    </w:p>
-    <w:p/>
-    <w:p>
-      <w:r>
-        <w:t>„Ne,“ přisvědčil, potěšený a vážný zároveň. „Ale přiláká lidi ke dveřím, aby slyšeli, jak ten kotel klepe. A až ho uslyší klepat, když budou stát před tou schránkou, už to nebudou moci přeslechnout.“ Schoval papír do kabátu.</w:t>
+        <w:t xml:space="preserve">„Postav sud,“ řekla jsem. „Já pro něj něco upeču a přitáhnu Nicka, aby ho odnesl. A vsadím se, že Greta taky něco upeče, jakmile se jí vrátí trouby, protože na téhle ulici není jediná duše, která by si její jméno nechala v okně a nedočkala se od ní na oplátku toho samého.“ Složila jsem jeho papír úhledně podle záhybu, jak to měl rád, a vrátila mu ho. „Společnost je pořád v maléru, Hale. Nenech se tou vlnou dobroty oklamat. Slovem zakladatelky kotel neopravíš.“</w:t>
+      </w:r>
+    </w:p>
+    <w:p/>
+    <w:p>
+      <w:r>
+        <w:t>„Ne,“ přisvědčil, potěšený a vážný zároveň. „Ale přivede lidi dovnitř, aby slyšeli, jak ten kotel klepe. A až ho uslyší klepat, když budou stát před tou schránkou, už to nebudou moci přeslechnout.“ Schoval papír do kabátu.</w:t>
       </w:r>
     </w:p>
     <w:p/>
@@ -2081,7 +2081,7 @@
     <w:p/>
     <w:p>
       <w:r>
-        <w:t xml:space="preserve">Peteovo řeznictví sídlilo na druhé straně návsi naproti Evergreen Avenue, v řadě obchůdků, které shlížely na náves z protější strany. Přešla jsem k němu po prohrnuté pěšině kolem památníku padlých. Jeho maso vozili dvorkem za obchůdky na Evergreen Avenue, stejným dvorkem, kudy se svážela mouka pro Gretu. Než jsem stála na jeho rohoži s ještě se houpejícím zvonkem nad hlavou, pořádně mi nedošlo, jak ten jediný dvorek spojuje jeho trable s těmi jejími. V obchodě bylo teplo. Voněl po studeném, čistém masu a pilinách a pod tím vším byl cítit slabý kovový nádech, který provázel všechna řeznictví, ať se drhla sebevíc. Pete stál za pultem v pruhované zástěře, ramenatý, s již prošedivělými skráněmi. Porcoval čtvrťku hovězího krátkými, úspornými tahy muže, který to dělal už čtyřicettisíckrát. Vzhlédl ke zvonku, poznal mě a v obličeji se mu zračila ostražitost. Byl to výraz člověka, který v poslední době zjistil, že lidé procházející jeho dveřmi po něm obvykle chtějí všichni to jedno a totéž.</w:t>
+        <w:t xml:space="preserve">Peteovo řeznictví sídlilo na druhé straně návsi naproti Evergreen Avenue, v řadě obchůdků, které shlížely na náves z protější strany. Přešla jsem k němu po prohrnuté pěšině kolem památníku padlých. Jeho maso vozili dvorkem za obchůdky na Evergreen Avenue, stejným dvorkem, kudy se svážela mouka pro Gretu. Dokud jsem nestanula na jeho rohoži s ještě se houpejícím zvonkem nad hlavou, pořádně mi nedošlo, jak ten jediný dvorek spojuje jeho trable s těmi jejími. V obchodě bylo teplo. Voněl po studeném, čistém masu a pilinách a pod tím vším byl cítit slabý kovový nádech, který provázel všechna řeznictví, ať se drhla sebevíc. Pete stál za pultem v pruhované zástěře, ramenatý, s již prošedivělými skráněmi. Porcoval čtvrťku hovězího krátkými, úspornými tahy muže, který to dělal už čtyřicettisíckrát. Vzhlédl ke zvonku, poznal mě a v obličeji se mu zračila ostražitost. Byl to výraz člověka, který v poslední době zjistil, že lidé procházející jeho dveřmi po něm obvykle chtějí všichni to jedno a totéž.</w:t>
       </w:r>
     </w:p>
     <w:p/>
@@ -2135,7 +2135,7 @@
     <w:p/>
     <w:p>
       <w:r>
-        <w:t xml:space="preserve">„Jo, tak nějak.“ Utáhl smyčku. „A celá ulice už se taky usnesla, komu to přišít na dveře. Tomu chlapíkovi přes náves, co má nade dveřmi své jméno.“ Řekl to naplno, s křivdou vyseknutou přímo před sebe, rozhořčeně a hlasitě, s bolestí, kterou by raději nesl středem třídy v poledne, než aby ji někam schoval. „No tak. Vždyť to víte. Pete Garcia a nakládací rampa, řetěz přes bránu, od léta na ni měl spadeno. Kdo jiný taky.“</w:t>
+        <w:t xml:space="preserve">„Jo, tak nějak.“ Utáhl smyčku. „A celá ulice už se taky usnesla, komu to přišít. Tomu chlapíkovi přes náves, co má nade dveřmi své jméno.“ Řekl to naplno, s křivdou vyseknutou přímo před sebe, rozhořčeně a hlasitě, s bolestí, kterou by raději nesl středem třídy v poledne, než aby ji někam schoval. „No tak. Vždyť to víte. Pete Garcia a nakládací rampa, řetěz přes bránu, od léta na ni měl spadeno. Kdo jiný taky.“</w:t>
       </w:r>
     </w:p>
     <w:p/>
@@ -2201,7 +2201,7 @@
     <w:p/>
     <w:p>
       <w:r>
-        <w:t xml:space="preserve">„Něco vám povím,“ řekl teď tišeji, s rozhořčením pryč z hlasu, „a naložte s tím, jak uznáte za vhodné, protože já sám v tom nemám jasno. Ta rána, co bývám ve tmě na dvorku, v tom nejsem sám.“ Otočil hlavu k přednímu oknu a výkladním skříním Evergreen Avenue naproti přes náves, s dvorkem schovaným za nimi z dohledu. „Někdo se motal vzadu za jejím obchodem. Brzy, ještě než je vidět do tváře, je vidět jen silueta, a hned to zmizí, jakmile se za rohem objeví moje světla. Viděl jsem to dvakrát. Možná třikrát. Někdo tam, kde v tu hodinu nemá co pohledávat, těsně u jejích zadních dveří, a pak pryč.“ Zamračil se na své ruce. „Poprvé jsem si myslel, že je to nějaký tulák, co se chce přihřát u jejích výdechů. Ale tulák se usadí, kdežto tenhle ne. Tenhle něco dělal. A zmizel, jakmile ho někdo spatřil. Jednoho rána tam stála neznámá dodávka, zaparkovaná na vzdáleném konci u lékárny se zhasnutými světly. Řezníkova to nebyla. Měla mimoměstskou značku, tu jsem nestihl zaregistrovat.“</w:t>
+        <w:t xml:space="preserve">„Něco vám povím,“ řekl teď tišeji, s rozhořčením pryč z hlasu, „a naložte s tím, jak uznáte za vhodné, protože já sám v tom nemám jasno. Ta rána, co bývám ve tmě na dvorku, v tom nejsem sám.“ Otočil hlavu k přednímu oknu a výkladním skříním Evergreen Avenue naproti přes náves, s dvorkem schovaným za nimi z dohledu. „Někdo se motal vzadu za jejím obchodem. Brzy, ještě než je vidět do tváře, je vidět jen silueta, a hned to zmizí, jakmile se za rohem objeví moje světla. Viděl jsem to dvakrát. Možná třikrát. Někdo tam, kde v tu hodinu nemá co pohledávat, těsně u jejích zadních dveří, a pak pryč.“ Zamračil se na své ruce. „Poprvé jsem si myslel, že je to nějaký tulák, co se chce přihřát u jejích výdechů. Ale tulák se usadí, kdežto tohle ne. Tohle něco dělalo. A zmizelo, jakmile to někdo spatřil. Jednoho rána tam stála neznámá dodávka, zaparkovaná na vzdáleném konci u lékárny se zhasnutými světly. Řezníkova to nebyla. Měla mimoměstskou značku, tu jsem nestihl zaregistrovat.“</w:t>
       </w:r>
     </w:p>
     <w:p/>
@@ -2476,7 +2476,7 @@
     </w:p>
     <w:p>
       <w:r>
-        <w:t xml:space="preserve">„Tohle je domov, který tomu stavím, aby si to přestalo půjčovat sněhuláky.“ Unavený, upřímný úsměv. „Ještě to není ono. Celé to potrvá ještě roky. Ale je to začátek, a dokud to nebude hotové, bude to dál pozlacovat svíčky a vodit dětské sněhuláky tmou, protože to chce být tady a nemá vlastní nohy. Bram je bez sebe. Myslí si, že je to nedůstojné, aby magie vyváděla veřejné kousky tam, kde ji město může vidět. Kdyby mohl, zavřel by ji do výběhu k sobům – a udržel by ji tam asi stejně úspěšně jako je.“</w:t>
+        <w:t xml:space="preserve">„Tohle je domov, který tomu stavím, aby si to přestalo půjčovat sněhuláky.“ Unavený, upřímný úsměv. „Ještě to není ono. Celé to potrvá ještě roky. Ale je to začátek, a dokud to nebude hotové, bude to dál pozlacovat svíčky a vodit dětské sněhuláky tmou, protože to chce být tady a nemá vlastní nohy. Bram je bez sebe. Myslí si, že je to nedůstojné, aby magie vyváděla veřejné kousky tam, kde ji město může vidět. Kdyby mohl, zavřel by ji do výběhu k sobům – a moc štěstí by s tím neměl.“</w:t>
       </w:r>
     </w:p>
     <w:p>
@@ -2527,7 +2527,7 @@
     <w:p/>
     <w:p>
       <w:r>
-        <w:t xml:space="preserve">Greta dostala výlohu zpátky tři dny po té cihle, sklo i zlatá písmena, a nápis HOLLY JOLLY BAKERY zase v celé šíři zářil nad vchodem díky Tomovi z železářství. Téhož rána otevřela dveře a narazila na takový nával zákazníků, až se jí málem chtělo brečet. Její pece naskočily zpátky tak podivně, jako vypověděly službu. Od incidentu s cihlou zamykala zadní vchod na závoru, ať už v kuchyni panovalo vedro, nebo ne, a každá další várka vyšla sladká jako med. Stála za opravenou vitrínou, poprášená moukou, a zářila na všechny strany. Prodávala zázvorky lidem ve frontě až ven a všem nahlas vykládala, že o téhle sezóně nikdy na vteřinu nepochybovala. Byla to lež. Krásná lež, a všichni na ulici jí ji shovívavě odpustili.</w:t>
+        <w:t xml:space="preserve">Greta dostala výlohu zpátky tři dny po té cihle, sklo i zlatá písmena, a nápis HOLLY JOLLY BAKERY zase v celé šíři zářil nad vchodem díky Tomovi z železářství. Téhož rána otevřela dveře a narazila na takový nával zákazníků, až se jí málem chtělo brečet. Její pece naskočily zpátky tak podivně, jako vypověděly službu. Od incidentu s cihlou zamykala zadní vchod na závoru, ať už v kuchyni panovalo vedro, nebo ne, a každá další várka vyšla sladká jako med. Stála za opravenou vitrínou, poprášená moukou, a zářila na všechny strany. Prodávala zázvorky lidem ve frontě až ven a všem nahlas vykládala, že o téhle sezóně nikdy na vteřinu nepochybovala. Byla to lež. Krásná lež, a všichni na ulici jí ji rádi nechali.</w:t>
       </w:r>
     </w:p>
     <w:p>
@@ -2542,7 +2542,7 @@
     </w:p>
     <w:p>
       <w:r>
-        <w:t>„Našla jste ji.“ Greta si otřela ruce a obešla vitrínu, stále zářící, ještě netušící, co se chystá. „Co pro vás můžu udělat?“</w:t>
+        <w:t>„Našel jste ji.“ Greta si otřela ruce a obešla vitrínu, stále zářící, ještě netušící, co se chystá. „Co pro vás můžu udělat?“</w:t>
       </w:r>
     </w:p>
     <w:p>
@@ -2755,7 +2755,7 @@
     <w:p/>
     <w:p>
       <w:r>
-        <w:t xml:space="preserve">To jméno ke mně dolehlo potichu a zblízka. Od někoho, kdo nechtěl být slyšen a styděl by se za to. Druhý den ráno jsem byla u Frostyho a plnila si pytlík moukou, kterou Hal schraňoval pro lidi s rozbitými troubami, zatímco Pip stála před konzervami se sardinkami v tiché prosbě. Měla jsem v úmyslu znovu upéct Gretiny sušenky u sebe v kuchyni do sudu. Dvě ženy u regálu s konzervami daly hlavy dohromady nad cenou topného oleje. Jedna z nich pronesla jméno, které jsem neznala. Druhá na to: „No, letos jsou tak strašně pozadu a zoufalí lidé dělají zoufalé věci.“ Ta první odvětila: „Já nic neříkám.“ Odšouraly se uličkou směrem k polévkám a svou malou krutost schovaly zase zpátky z dohledu. Aniž tušily, že ji upustily. Aniž tušily, že jsem ji zvedla.</w:t>
+        <w:t xml:space="preserve">To jméno ke mně dolehlo potichu a jaksi bokem. Od někoho, kdo nechtěl být slyšen a styděl by se za to. Druhý den ráno jsem byla u Frostyho a plnila si pytlík moukou, kterou Hal schraňoval pro lidi s rozbitými troubami, zatímco Pip stála před konzervami se sardinkami v tiché prosbě. Měla jsem v úmyslu znovu upéct Gretiny sušenky u sebe v kuchyni do sudu. Dvě ženy u regálu s konzervami daly hlavy dohromady nad cenou topného oleje. Jedna z nich pronesla jméno, které jsem neznala. Druhá na to: „No, letos jsou tak strašně pozadu a zoufalí lidé dělají zoufalé věci.“ Ta první odvětila: „Já nic neříkám.“ Odšouraly se uličkou směrem k polévkám a svou malou krutost schovaly zase zpátky z dohledu. Aniž tušily, že ji upustily. Aniž tušily, že jsem ji zvedla.</w:t>
       </w:r>
     </w:p>
     <w:p>
@@ -2875,7 +2875,7 @@
     </w:p>
     <w:p>
       <w:r>
-        <w:t xml:space="preserve">Jenže cihla a barva byly tou hlučnou částí a hlučná část byla tou nejmenší. Pod tím vším ležela mouka. Jestli do ní něco přišlo, pochybovala jsem, že to vzešlo z domácí spíže. Zkazilo to tři těsta úplně stejně a kazilo to dál, i když Greta vydrhla kuchyni a otevřela nové droždí. Cokoliv to provedlo, vyžadovalo to znalost: co použít, jak to použít a jak se dostat k zásobníku za zamčenými dveřmi. Zoufalý Marc Doucette by byl hlučný a nešikovný. Vzal by to, co je po ruce. Nevedl by trpělivou a pečlivou kampaň proti pekařství. Byl by příliš zaměstnaný tím, že má hlad.</w:t>
+        <w:t xml:space="preserve">Jenže cihla a barva byly tou hlučnou částí a hlučná část byla tou nejmenší. Pod tím vším ležela mouka. Jestli do ní něco přišlo, pochybovala jsem, že to vzešlo z domácí spíže. Zkazilo to tři těsta úplně stejně a kazilo to dál, i když Greta vydrhla kuchyni a otevřela nové droždí. Cokoliv to provedlo, vyžadovalo to znalost: co použít, kolik toho přidat a jak se dostat k zásobníku za zamčenými dveřmi. Zoufalý Marc Doucette by byl hlučný a nešikovný. Vzal by to, co je po ruce. Nevedl by trpělivou a pečlivou kampaň proti pekařství. Byl by příliš zaměstnaný tím, že má hlad.</w:t>
       </w:r>
     </w:p>
     <w:p>
@@ -2941,7 +2941,7 @@
     </w:p>
     <w:p>
       <w:r>
-        <w:t xml:space="preserve">„To je.“ Nedošla jsem v myšlenkách až do konce tam v teplém pachu Frostyho obchodu, zatímco se sud u dveří plnil, protože jména jsem předtím vyslovila příliš rychle a draze za to zaplatila ve městech, odkud jsem musela odejít. Pole se mi však pod nohama zúžilo, zatímco jsem tam stála. Žádný kluk s plechovkou. Žádný řezník, který na vás řve do očí. Žádný otec počítající poslední polínko. Někdo s řemeslem v rukou, dodavatelem v knize a důvodem, proč chce, aby nejstarší pekařství na třídě před Vánocemi zhaslo.</w:t>
+        <w:t xml:space="preserve">„To je.“ Nedošla jsem v myšlenkách až do konce tam v teplém pachu Frostyho obchodu, zatímco se sud u dveří plnil, protože jména jsem předtím vyslovila příliš rychle a draze za to zaplatila ve městech, odkud jsem nemohla odejít. Pole se mi však pod nohama zúžilo, zatímco jsem tam stála. Žádný kluk s plechovkou. Žádný řezník, který na vás řve do očí. Žádný otec počítající poslední polínko. Někdo s řemeslem v rukou, dodavatelem v knize a důvodem, proč chce, aby nejstarší pekařství na třídě před Vánocemi zhaslo.</w:t>
       </w:r>
     </w:p>
     <w:p/>
@@ -3053,7 +3053,7 @@
     </w:p>
     <w:p>
       <w:r>
-        <w:t>Vyšla jsem do chladu se sklenicí zpátky v kabátu a s pocitem, že se ve mně všechno zhroutilo a přerovnalo. Pip vyšla za mnou po schůdcích a držela se dál na mé odvrácené straně, co nejdál od kapsy se sklenicí.</w:t>
+        <w:t>Vyšla jsem do chladu se sklenicí zpátky v kabátu a s pocitem, že se ve mně všechno přerovnalo. Pip vyšla za mnou po schůdcích a držela se dál na mé odvrácené straně, co nejdál od kapsy se sklenicí.</w:t>
       </w:r>
     </w:p>
     <w:p>
@@ -3068,7 +3068,7 @@
     </w:p>
     <w:p>
       <w:r>
-        <w:t xml:space="preserve">Nedokázala bych k tomu přiřadit konkrétní obličej, i když celé město by to jistě svedlo. Půda pod touto otázkou se však mezitím posunula, zatímco jsem stála na doktorových schodech. To, co se stalo Gretinu pečení, teď mělo svou odpověď, schovanou ve zavařovací sklenici v mém kabátu. Zbývalo jen zjistit, kdo na této třídě mohl mít k té mouce přístup a znal přesnou dávku, jak ji zničit.</w:t>
+        <w:t xml:space="preserve">Nepřiřadila jsem k tomu konkrétní obličej, i když město by to jistě udělalo. Půda pod touto otázkou se však mezitím posunula, zatímco jsem stála na doktorových schodech. To, co se stalo Gretinu pečení, teď mělo svou odpověď, schovanou ve zavařovací sklenici v mém kabátu. Zbývalo jen zjistit, kdo na této třídě mohl mít k té mouce přístup a znal přesnou dávku, jak ji zničit.</w:t>
       </w:r>
     </w:p>
     <w:p>
@@ -3124,7 +3124,7 @@
     <w:p/>
     <w:p>
       <w:r>
-        <w:t xml:space="preserve">Otázka přes noc změnila tvar – jako když člověk nosí moc dlouho v kapse kámen, až se ohladí a zbude z něj do rána jediné ostré slovo. Přístup. Doktor svým povídáním o hnědých lahvičkách odpověděl na to, co to bylo, a mně nechal celou otázku po tom, kdo. A kdo začínal, jak už u takových otázek bývá, prostší věcí. Ne kdo ji nenáviděl. Kdo se mohl dostat k její mouce.</w:t>
+        <w:t xml:space="preserve">Otázka přes noc změnila tvar – jako když člověk nosí moc dlouho v kapse kámen, až se ohladí a zbude z něj do rána jediné tvrdé slovo. Přístup. Doktor svým povídáním o hnědých lahvičkách odpověděl na to, co to bylo, a mně nechal celou otázku po tom, kdo. A kdo začínal, jak už u takových otázek bývá, prostší věcí. Ne kdo ji nenáviděl. Kdo se mohl dostat k její mouce.</w:t>
       </w:r>
     </w:p>
     <w:p/>
@@ -3196,7 +3196,7 @@
     <w:p/>
     <w:p>
       <w:r>
-        <w:t>„Takže,“ řekla jsem tiše k Pip. „Nezamčené. Nehlídané. Otevřené vzduchu, zády k nim, každé temné ráno až do té cihly. Kdokoli, kdo do téhle uličky před rozedněním patřil, mohl stát přesně tady.“</w:t>
+        <w:t>„Takže,“ řekla jsem tiše k Pip. „Nezamčené. Nehlídané. Otevřené dokořán a ona k nim zády, každé temné ráno až do té cihly. Kdokoli, kdo do téhle uličky před rozedněním patřil, mohl stát přesně tady.“</w:t>
       </w:r>
     </w:p>
     <w:p/>
@@ -3286,7 +3286,7 @@
     <w:p/>
     <w:p>
       <w:r>
-        <w:t xml:space="preserve">„Mně se taky nelíbí, kam ta mapa ukazuje,“ řekla jsem. Podívala jsem se naposledy do studeného chřtánu rampy, na Gretiny nízké dveře, které stávaly otevřené polovinu každého temného rána až do té cihly, a o tři dál na řezníkovu bránu, kde měl poctivý člověk víc než dost důvodů být ještě před světlem. „Víc se mi líbil minulý týden. To byl jen řetěz a trochu křiku. Přístup je něco, přes co se člověk hůř přenáší.“</w:t>
+        <w:t xml:space="preserve">„Mně se taky nelíbí, kam ta mapa ukazuje,“ řekla jsem. Podívala jsem se naposledy do studeného chřtánu rampy, na Gretiny nízké dveře, které stávaly otevřené polovinu každého temného rána až do té cihly, a o tři dál na řezníkovu bránu, kde měl poctivý člověk víc než dost důvodů být ještě před světlem. „Víc se mi líbil minulý týden. To byl jen řetěz a trochu křiku. Přístup se nedá jen tak přejít mávnutím ruky.“</w:t>
       </w:r>
     </w:p>
     <w:p/>
@@ -3334,7 +3334,7 @@
     <w:p/>
     <w:p>
       <w:r>
-        <w:t>Připadalo mi to jako laskavé gesto, teplé jídlo přivezené až z Bridgtonu pro ženu, která na ni minulý týden přes pult vyštěkla jediné slovo.</w:t>
+        <w:t>Připadalo mi to jako laskavé gesto, teplé jídlo přivezené až z Bridgtonu pro ženu, která s ní minulý týden přes pult prohodila jediné slovo.</w:t>
       </w:r>
     </w:p>
     <w:p/>
@@ -3363,7 +3363,7 @@
     <w:p/>
     <w:p>
       <w:r>
-        <w:t xml:space="preserve">Vezměte v úvahu tu zášť, řekla jsem konvici, protože Pip ještě spala a nedalo se to vykládat jí. Pete mi ten den, co jsem přišla pro pečeni, bez vyžádání vyklopil na pult celou tu odpornou historii sporu. Kdokoliv nasypal ten prášek, naplánoval si postup tak, aby ho nikdo neviděl ani neslyšel, a Pete si založil život na tom, že je obojí.</w:t>
+        <w:t xml:space="preserve">Vezměte v úvahu tu zášť, řekla jsem konvici, protože Pip ještě spala a nedalo se to vykládat jí. Pete mi ten den, co jsem přišla pro pečeni, bez vyžádání vyklopil na pult celou tu odpornou historii sporu. Kdokoliv nasypal ten prášek, naplánoval si postup tak, aby ho nikdo neviděl ani neslyšel, a Pete si založil život na tom, že je ho vidět i slyšet.</w:t>
       </w:r>
     </w:p>
     <w:p/>
@@ -3435,7 +3435,7 @@
     <w:p/>
     <w:p>
       <w:r>
-        <w:t xml:space="preserve">„Ta postava, o které jsem vám říkal,“ řekl a balil kotletu, kterou jsem si vůbec neobjednala. „U jejích zadních dveří ve tmě. Určitě to budete chtít slyšet celé, když už mi věříte.“ Položil obě velké dlaně na špalek a zahleděl se z okna na výlohy Evergreen Avenue na druhé straně návsi, jako by skrz ně viděl až na onen dvorek. „Dospělý. Žádný fracek, ať si město klidně mele svou o nějakém klukovi s plechovkou barvy. Vyšší než Greta a pohyboval se cílevědomě. Žádné courání. Žádné ohřívání rukou. Přesně věděl, proč tam je. A zakuklený. Dlouhý kabát nebo plášť, volný, takový ten pracovní, aby se člověk neušpinil, světlý, skoro bych řekl, i když tma tu barvu spolkla. Přitisknutý těsně ke zdi, kam vede rampa pro zboží a kudy normálně nikdo nechodí. A když se objevila světla mého auta, byl pryč, rychle a potichu, nebyl to žádný útěk, prostě odcházel. Žádný spěch. Hotovo a pryč.“ Zavrtěl šedivou hlavou. „Žádná tvář. Tvář jsem nikdy neviděl. Jen pracovní siluetu, co si dávala pozor, aby nebyla vidět, a znala Gretin harmonogram líp, než by cizí člověk měl.“ Zavázal balíček provázkem. „A pak ještě ta dodávka, jedno ráno. Stála u lékárny, motor tiše klapal. Vysoká střecha, vyšší, než u dodávky bývá, s červeným reflexním proužkem na zadních dveřích. Svítilo to jak Vánoce, když na to padla moje světla.“</w:t>
+        <w:t xml:space="preserve">„Ta postava, o které jsem vám říkal,“ řekl a balil kotletu, kterou jsem si vůbec neobjednala. „U jejích zadních dveří ve tmě. Určitě to budete chtít slyšet celé, když už mi věříte.“ Položil obě velké dlaně na špalek a zahleděl se z okna na výlohy Evergreen Avenue na druhé straně návsi, jako by skrz ně viděl až na onen dvorek. „Dospělý člověk. Žádný fracek, ať si město klidně mele svou o nějakém klukovi s plechovkou barvy. Vyšší než Greta a pohybovalo se to cílevědomě. Žádné courání. Žádné ohřívání rukou. Přesně to vědělo, proč tam je. A zahalené. Dlouhý kabát nebo plášť, volný, takový ten pracovní, aby se člověk neušpinil, světlý, skoro bych řekl, i když tma tu barvu spolkla. Přitisknuté těsně ke zdi, kam vede rampa pro zboží a kudy normálně nikdo nechodí. A když se objevila světla mého auta, bylo to pryč, rychle a potichu, nebyl to žádný útěk, prostě to odešlo. Žádný spěch. Hotovo a pryč.“ Zavrtěl šedivou hlavou. „Žádná tvář. Tvář jsem nikdy neviděl. Jen pracovní siluetu, co si dávala pozor, aby nebyla vidět, a znala Gretin harmonogram líp, než by cizí člověk měl.“ Zavázal balíček provázkem. „A pak ještě ta dodávka, jedno ráno. Stála u lékárny, motor tiše klapal. Vysoká střecha, vyšší, než u dodávky bývá, s červeným reflexním proužkem na zadních dveřích. Svítilo to jak Vánoce, když na to padla moje světla.“</w:t>
       </w:r>
     </w:p>
     <w:p/>
@@ -3530,12 +3530,12 @@
     </w:p>
     <w:p>
       <w:r>
-        <w:t>Stála u pultu v zavřeném obchodě, na dveřích se pořád ještě skvěla cedulka ZAVŘENO a sklo ve dveřích bylo přesklené, její jméno na něm opět zářilo zlatem. Pip zamířila rovnou k nové tabulce a stála a pozorovala skrze ni ulici, jako by kontrolovala, jestli je výhled zase v pořádku. Když jsem vyslovila jeho jméno, Greta ztuhla.</w:t>
-      </w:r>
-    </w:p>
-    <w:p>
-      <w:r>
-        <w:t xml:space="preserve">„Danny.“ Otřela si ruce do zástěry. „Říkají, že to byl Danny. Včera jsem se to dozvěděla a od té doby jsem neusnula.“ Obešla pult. „Jessiko, toho kluka jsem propustila z toho nejprostšího důvodu na světě a on za nic z toho nemohl. Podzimní obchody vázly a já si nemohla dovolit platit brigádníka na víkendy. Posadila jsem ho a narovinu mu to řekla, dala jsem mu výplatu za dva týdny, které už neodpracoval, a k tomu krabici včerejšího pečiva pro mámu. Vzal to potichu, styděl se za slzy v očích a byl pryč dřív, než jsem stihla říct polovinu toho, co jsem chtěla.“ Hlas se jí zadrhl. „Dobrý pracovník. Dlouho se rozkoukával, ale pak byl spolehlivý. A teď z něj dělají toho, kdo mi na zeď namaloval ŠPINAVÉ, a já to nedokážu spojit s klukem, který mi dřív ranní krabice rovnal do komínků, protože nesnesl, když byly nakřivo.“</w:t>
+        <w:t>Stála u pultu v zavřeném obchodě, na dveřích se pořád ještě skvěla cedulka ZAVŘENO a výloha byla nově zasklená, její jméno na něm opět zářilo zlatem. Pip zamířila rovnou k nové tabulce a stála a pozorovala skrze ni ulici, jako by kontrolovala, jestli je výhled zase v pořádku. Když jsem vyslovila jeho jméno, Greta ztuhla.</w:t>
+      </w:r>
+    </w:p>
+    <w:p>
+      <w:r>
+        <w:t xml:space="preserve">„Danny.“ Otřela si ruce do zástěry. „Říkají, že to byl Danny. Včera jsem se to dozvěděla a od té doby jsem neusnula.“ Obešla pult. „Jessico, toho kluka jsem propustila z toho nejprostšího důvodu na světě a on za nic z toho nemohl. Podzimní obchody vázly a já si nemohla dovolit platit brigádníka na víkendy. Posadila jsem ho a narovinu mu to řekla, dala jsem mu výplatu za dva týdny, které už neodpracoval, a k tomu krabici včerejšího pečiva pro mámu. Vzal to potichu, styděl se za slzy v očích a byl pryč dřív, než jsem stihla říct polovinu toho, co jsem chtěla.“ Hlas se jí zadrhl. „Dobrý pracovník. Dlouho se rozkoukával, ale pak byl spolehlivý. A teď z něj dělají toho, kdo mi na zeď namaloval ŠPINAVÉ, a já to nedokážu spojit s klukem, který mi dřív ranní krabice rovnal do komínků, protože nesnesl, když byly nakřivo.“</w:t>
       </w:r>
     </w:p>
     <w:p>
@@ -3570,7 +3570,7 @@
     </w:p>
     <w:p>
       <w:r>
-        <w:t>„Posaď se,“ řekla jsem ne tak docela nevlídně a sedla si na jeden konec lavičky.</w:t>
+        <w:t>„Posaď se,“ řekla jsem vlídně a sedla si na jeden konec lavičky.</w:t>
       </w:r>
     </w:p>
     <w:p>
@@ -3625,7 +3625,7 @@
     </w:p>
     <w:p>
       <w:r>
-        <w:t>„Tak se toho drž,“ řekla jsem, „a řekni mi to, až se ti to rozleží v hlavě. Nepřikrášluj to.“</w:t>
+        <w:t>„Tak se toho drž,“ řekla jsem, „a přijď s tím za mnou, až se ti to vyjasní. Nepřikrášluj to.“</w:t>
       </w:r>
     </w:p>
     <w:p>
@@ -3817,7 +3817,7 @@
     </w:p>
     <w:p>
       <w:r>
-        <w:t>K deváté hodině byla krabice na Halův sud do poloviny plná čepic, většinu z nich přinesli hotové z domova, a kamna dohořela na žhavé uhlíky. Ivy ustřihla vlnu a nechala zbytek modrého ležet tam, kde ležel v červeném hnízdě pod oknem. Pip si ho zastrčila pod bradu a zavřela oči.</w:t>
+        <w:t>K deváté hodině byla krabice na Halův sud do poloviny plná čepic, většinu z nich přinesly hotové z domova, a kamna dohořela na žhavé uhlíky. Ivy ustřihla vlnu a nechala zbytek modrého ležet tam, kde ležel v červeném hnízdě pod oknem. Pip si ho zastrčila pod bradu a zavřela oči.</w:t>
       </w:r>
     </w:p>
     <w:p>
@@ -3876,7 +3876,7 @@
     <w:p/>
     <w:p>
       <w:r>
-        <w:t>„Sežeň dva. Máme toho ještě dost.“ Otočila se a objevila mě po svém boku. „Jessiko. Jakpak se má?“</w:t>
+        <w:t>„Sežeň dva. Máme toho ještě dost.“ Otočila se a objevila mě po svém boku. „Jessico. Jakpak se má?“</w:t>
       </w:r>
     </w:p>
     <w:p/>
@@ -3945,7 +3945,7 @@
     <w:p/>
     <w:p>
       <w:r>
-        <w:t xml:space="preserve">„Bude to stačit,“ pronesl tiše, sotva těm slovům věřil. „Společnost. Nikdo nepožadoval ani dolar a příspěvky přesto přicházejí. Starý Ferris, penzista z továrny, říká, že zaplatí celý kotel, když město dá střechu. Zachrání to místo, Jessiko. Vlastníma rukama. Nemyslel jsem, že se dožiju toho, že o to budou stát tak moc.“</w:t>
+        <w:t xml:space="preserve">„Bude to stačit,“ pronesl tiše, sotva těm slovům věřil. „Společnost. Nikdo nepožadoval ani dolar a příspěvky přesto přicházejí. Starý Ferris, penzista z továrny, říká, že zaplatí celý kotel, když město dá střechu. Zachrání to místo, Jessico. Vlastníma rukama. Nemyslel jsem, že se dožiju toho, že o to budou stát tak moc.“</w:t>
       </w:r>
     </w:p>
     <w:p/>
@@ -4008,7 +4008,7 @@
         <w:t xml:space="preserve">Týden. Možná déle, jestli nedodají díly k tomu umyvadlu.</w:t>
       </w:r>
       <w:r>
-        <w:t xml:space="preserve"> Týden, kdy bylo Gretino povolení pozastaveno do doby nápravy, kdy Holly Jolly zůstane temná a celý její první nápor sezóny byl smeten čistě od podlahy. Ten jediný týden v celém jasném běhu k Vánocům, kdy nejstarší pekařství na Evergreen Avenue zhasne.</w:t>
+        <w:t xml:space="preserve"> Týden, kdy bylo Gretino povolení pozastaveno do doby nápravy, kdy Holly Jolly zůstane temné a celý její první nápor sezóny byl smeten čistě od podlahy. Ten jediný týden v celém jasném běhu k Vánocům, kdy nejstarší pekařství na Evergreen Avenue zhasne.</w:t>
       </w:r>
     </w:p>
     <w:p/>
@@ -4113,7 +4113,7 @@
     <w:p/>
     <w:p>
       <w:r>
-        <w:t xml:space="preserve">Motiv se mi celou dobu od prvního dne ukazoval před očima v podobě ženy zahalené do vůně přepuštěného másla, která říkala: </w:t>
+        <w:t xml:space="preserve">Motiv se mi celou dobu od prvního dne ukazoval před očima v podobě ženy zahalené do vůně hnědého másla, která říkala: </w:t>
       </w:r>
       <w:r>
         <w:rPr>
@@ -4192,7 +4192,7 @@
     </w:p>
     <w:p>
       <w:r>
-        <w:t xml:space="preserve">Na věnci jsem se rozhodla už za tmy, zatímco Nick spal – byla to jediná záminka, s níž projdu jejím zlatým vchodem bez falešného tónu – protože tahle záminka falešná nebyla. Ženy z kroužku vyzdobily na svátky celou třídu, dveře každého obchodu, a nový obchod znamenal nové dveře. Nenabídnout Sugarplum věneček v týdnu, kdy měla otevřít, by bylo nápadné. Takže až budu mít ruce v chvojí, udělám i to druhé, kvůli čemu jsem tam šla. Prohlédnu si ji zblízka. Dost blízko na to, abych zachytila, co se skrývá pod tím kouzlem. Stejně to bylo i s Petem a jeho špalíkem.</w:t>
+        <w:t xml:space="preserve">Na věnci jsem se rozhodla už za tmy, zatímco Nick spal – byla to jediná záminka, s níž projdu jejím zlatým vchodem bez falešného tónu – protože tahle záminka falešná nebyla. Ženy z kroužku vyzdobily na svátky celou třídu, dveře každého obchodu, a nový obchod znamenal nové dveře. Nenabídnout Sugarplum věneček v týdnu, kdy otevřela, by bylo nápadné. Takže až budu mít ruce v chvojí, udělám i to druhé, kvůli čemu jsem tam šla. Prohlédnu si ji zblízka. Dost blízko na to, abych zachytila, co se skrývá pod tím kouzlem. Stejně to bylo i s Petem a jeho špalíkem.</w:t>
       </w:r>
     </w:p>
     <w:p>
@@ -4237,12 +4237,12 @@
     </w:p>
     <w:p>
       <w:r>
-        <w:t>„Prosincový shon na téhle ulici ještě neznáte,“ řekla uvolněně a stavěla přede mě šálek. „Prostudovala jsem si statistiky. Počet obyvatel, farní setkání, školu, celý ten váš sváteční kalendář. O Vánocích se tu protočí víc peněz za sladkosti, než kolik jich tu kdy bylo utratit, protože tady lidé dosud chodili jen do jediného starého pekařství. Za venkovské ceny. Za venkovské zboží.“ Spojení „jediného starého pekařství“ pronesla s úsměvem a mluvila o něm, jako o něčem dávno patřícím do minulosti. „A všichni ti zákazníci teď hledají, kam by zašli. A já jsem tady.“</w:t>
-      </w:r>
-    </w:p>
-    <w:p>
-      <w:r>
-        <w:t>„Greta vede podnik už pěkně dlouho,“ poznamenala jsem mírně.</w:t>
+        <w:t>„Prosincový shon na téhle ulici ještě neznáte,“ řekla uvolněně a stavěla přede mě šálek. „Prostudovala jsem si statistiky. Počet obyvatel, farní setkání, školu, celý ten váš sváteční kalendář. O Vánocích se tu protočí víc peněz za sladkosti, než kolik jich tu kdy lidé měli kde utratit, protože tady lidé dosud chodili jen do jediného starého pekařství. Za venkovské ceny. Za venkovské zboží.“ Spojení „jediného starého pekařství“ pronesla s úsměvem a mluvila o něm, jako o něčem dávno patřícím do minulosti. „A všichni ti zákazníci teď hledají, kam by zašli. A já jsem tady.“</w:t>
+      </w:r>
+    </w:p>
+    <w:p>
+      <w:r>
+        <w:t>„Greta tu sezónu zvládá už pěkně dlouho,“ poznamenala jsem mírně.</w:t>
       </w:r>
     </w:p>
     <w:p>
@@ -4322,7 +4322,7 @@
     </w:p>
     <w:p>
       <w:r>
-        <w:t>Šla jsem. Vracely jsme se po hlavní třídě v šedivém, plochém dopoledni. O kousek dál dole stál Holly Jolly se ztemnělými výlohami a žlutým papírem za sklem, zavřený už pátý den. Nezastavila jsem se u něj. Kdybych stála na chodníku a truchlila nad zavřeným krámem, lidem by to vrtalo hlavou.</w:t>
+        <w:t>Šla jsem. Vracely jsme se po hlavní třídě v šedivém, plochém dopoledni. O kousek dál dole stálo Holly Jolly se ztemnělými výlohami a žlutým papírem za sklem, zavřené už pátý den. Nezastavila jsem se u něj. Kdybych stála na chodníku a truchlila nad zavřeným krámem, lidem by to vrtalo hlavou.</w:t>
       </w:r>
     </w:p>
     <w:p>
@@ -4409,7 +4409,7 @@
     <w:p/>
     <w:p>
       <w:r>
-        <w:t xml:space="preserve">„Jednoho rána jsem vzadu u Gretina obchodu někoho viděl. Úplná tma, ještě než jí začaly péct pece, v okně ještě světlo nesvítilo. Dospělý člověk v pekařské zástěře. Greta ne. Greta je robustní a tahle osoba byla štíhlá. Rychlá a úhledná, ne jako někdo, kdo začíná směnu. Dlouhá zástěra, taková ta až po holeně, světlá, pod ní kabát. Chvíli stála u jejího zadního schodu a pak zamířila uličkou ke vzdálenějšímu konci. Nikam dovnitř nevešla. Ztratila se mi za světlem u lékárny.“ Zamračil se. „Myslel jsem, že je to nějaký rozvoz.“</w:t>
+        <w:t xml:space="preserve">„Jednoho rána jsem vzadu u Gretina obchodu někoho viděl. Úplná tma, ještě než jí začaly péct pece, v okně ještě světlo nesvítilo. Dospělý člověk v pekařské zástěře. Greta ne. Greta je robustní a tahle osoba byla štíhlá. Pohybovalo se to rychle a úhledně, ne jako někdo, kdo začíná směnu. Dlouhá zástěra, taková ta až po holeně, světlá, pod ní kabát. Chvíli to stálo u jejího zadního schodu a pak to zamířilo uličkou ke vzdálenějšímu konci. Nikam dovnitř to nevešlo. Ztratilo se mi to za světlem u lékárny.“ Zamračil se. „Myslel jsem, že je to nějaký rozvoz.“</w:t>
       </w:r>
     </w:p>
     <w:p/>
@@ -4421,7 +4421,7 @@
     <w:p/>
     <w:p>
       <w:r>
-        <w:t>„Byla tam krabice. Jiné ráno. Stála venku u Gretiných zadních dveří a nebyl to jeden z jejích pytlů na mouku. Byla to potištěná krabice a pamatuju si ji, protože měla na sobě zlato. Zlatý nápis po straně. Z našeho okna jsem to nepřečetl.“ Podíval se na mě. „Když jsem se podíval znovu, byla pryč. Říkala jste, ať vám to přinesu, až se mi to vybaví.“</w:t>
+        <w:t>„Byla tam krabice. Jiné ráno. Stála venku u Gretiných zadních dveří a nebyl to jeden z jejích pytlů na mouku. Byla to potištěná krabice a pamatuju si ji, protože měla na sobě zlato. Zlatý nápis po straně. Z našeho okna jsem to nepřečetl.“ Podíval se na mě. „Když jsem se podíval znovu, byla pryč. Říkala jste, ať vám to přinesu, až se mi to vyjasní.“</w:t>
       </w:r>
     </w:p>
     <w:p/>
@@ -4786,7 +4786,7 @@
     <w:p/>
     <w:p>
       <w:r>
-        <w:t>Mráz přišel bez jakéhokoliv varování v předpovědi, jak mi Dot říkávala, že to ty kruté mrazy dělají. Zůstala jen bezvětrná obloha a teplota, která celou noc padala dolů jako odhozený kámen. Probudila jsem se a okna byla až v koutech zamrzlá do tvaru kapradin, potrubí ve stěnách tiše klepalo chladem a já jsem dřív než na cokoliv jiného pomyslela na úzkou cihlovou budovu Společnosti na náměstí a na starý kotel, který ve sklepě rachotil. Kotel, který už při mírné oblevě stěží stíhal, nemohl za takové mrazivé noci vydržet.</w:t>
+        <w:t>Mráz přišel bez jakéhokoliv varování v předpovědi, jak mi Dot říkávala, že to ty kruté mrazy dělají. Zůstala jen bezvětrná obloha a teplota, která celou noc padala dolů jako odhozený kámen. Probudila jsem se a okna byla až v koutech zamrzlá do tvaru kapradin, potrubí ve stěnách tiše klepalo chladem a já jsem dřív než na cokoliv jiného pomyslela na úzkou cihlovou budovu Společnosti na náměstí a na starý kotel, který ve sklepě rachotil. Kotel, který už při mírné oblevě stěží stíhal, nemusel za takhle mrazivé noci vždycky vydržet.</w:t>
       </w:r>
     </w:p>
     <w:p/>
@@ -5223,7 +5223,7 @@
     </w:p>
     <w:p>
       <w:r>
-        <w:t xml:space="preserve">„Nikdy jsem neřekla, že jsem se zbláznila,“ opáčila Martha. „Řekla jsem, že je to zvláštní.“ Natočila ke mně telefon, abych viděla protokol hovorů svítící na displeji. „Včera mi někdo volal, zrovna při večeři. Žena. Milá. Věcná. Říkala, že volá z Wendt's Bakehouse tam v Bridgtonu, a že když je Holly Jolly zavřené, rádi mi moji objednávku pro Holly Jolly vyřídí. Dva čokoládovo-pekanové koláče a tucet housek, připravené ve středu před Díkůvzdáním.“ Spustila telefon níže. „To je moje objednávka. Do posledního rohlíku.“</w:t>
+        <w:t xml:space="preserve">„Nikdy jsem neřekla, že jsem se zbláznila,“ opáčila Martha. „Řekla jsem, že je to zvláštní.“ Natočila ke mně telefon, abych viděla protokol hovorů svítící na displeji. „Včera mi někdo volal, zrovna při večeři. Žena. Milá. Věcná. Říkala, že volá z Wendt's Bakehouse tam v Bridgtonu, a že když je Holly Jolly zavřené, rádi mi moji objednávku pro Holly Jolly vyřídí. Dva čokoládovo-pekanové koláče a tucet housek, připravené ve středu před Díkůvzdáním.“ Spustila telefon níže. „To je moje objednávka. Do poslední housky.“</w:t>
       </w:r>
     </w:p>
     <w:p>
@@ -5529,7 +5529,7 @@
     </w:p>
     <w:p>
       <w:r>
-        <w:t>„Ten dopis v srpnu,“ řekla jsem. „Ta firma, od které tě chtěli vyplatit. Pamatuješ si jméno?“</w:t>
+        <w:t>„Ten dopis v srpnu,“ řekla jsem. „Ta firma, co tě chtěla vykoupit. Pamatuješ si jméno?“</w:t>
       </w:r>
     </w:p>
     <w:p>
@@ -5549,7 +5549,7 @@
     </w:p>
     <w:p>
       <w:r>
-        <w:t>„K Pelkeymu do Lewistonu. Všichni velkoobchodní pekaři na téhle straně hor berou od Pelkeyho.“ Zhluboka se nadechla. „Joyce nám tam tenkrát sama zařídila účet, hned první rok, a když odešla, vzala si ho s sebou a nezměnila ho. Joyce by se radši s dodavatelem pohádala, než aby od něj odešla.“ Další nádech. „Nezastavuj se u mě dneska. A buď tak hodná a netvař se na mě v telefonu soucitně. To bych neunesla.“</w:t>
+        <w:t>„K Pelkeymu do Lewistonu. Všichni velkoobchodní pekaři na téhle straně hor berou od Pelkeyho.“ Zhluboka se nadechla. „Joyce nám tam tenkrát sama zařídila účet, hned první rok, a když odešla, vzala si ho s sebou a určitě ho nezměnila. Joyce by se radši s dodavatelem pohádala, než aby od něj odešla.“ Další nádech. „Nezastavuj se u mě dneska. A buď tak hodná a netvař se na mě v telefonu soucitně. To bych neunesla.“</w:t>
       </w:r>
     </w:p>
     <w:p>
@@ -5687,7 +5687,7 @@
     </w:p>
     <w:p>
       <w:r>
-        <w:t xml:space="preserve">„To je ona,“ řekl Pete. „Ta páska. Když mi světlomety vjely do zatáčky, zablýsklo se to vzadu červeně přes dveře, jako by na ně někdo navěsil světýlka. A ta střecha je vysoká takhle. Vyšší, než dodávka potřebuje, to mi utkvělo v paměti.“ Poklepal prstem na značku. „Maine. Věděl jsem, že není naše. Číslo jsem si nezapsal a nikomu to vykládat nebudu.“</w:t>
+        <w:t xml:space="preserve">„To je ona,“ řekl Pete. „Ta páska. Když mi světlomety vjely do zatáčky, zablýsklo se to vzadu červeně přes dveře, jako by na ně někdo navěsil světýlka. A ta střecha je vysoká takhle. Vyšší, než dodávka potřebuje, to mi utkvělo v paměti.“ Poklepal prstem na značku. „Maine. Věděl jsem, že není naše. Číslo jsem si nezapsal a nebudu nikomu tvrdit, že jo.“</w:t>
       </w:r>
     </w:p>
     <w:p>
@@ -5952,7 +5952,7 @@
     </w:p>
     <w:p>
       <w:r>
-        <w:t>„Sama o sobě je to pekařka, která kupuje to, co pekařky kupují,“ řekla. „Mohla bych to najít v polovině velkoobchodních kuchyní ve státě.“ Položila Clairein list vedle něj. „Právě všechno ostatní z toho dělá případ.“</w:t>
+        <w:t>„Sama o sobě je to pekařka, která kupuje to, co pekařky kupují,“ řekla. „Mohla bych to najít v polovině velkoobchodních kuchyní ve státě.“ Položila Clairein list vedle ní. „Právě všechno ostatní z toho dělá případ.“</w:t>
       </w:r>
     </w:p>
     <w:p>
@@ -6152,7 +6152,7 @@
     <w:p/>
     <w:p>
       <w:r>
-        <w:t>Joyce Wendtová přišla ve dvě hodiny s bílým papírovým pytlíkem rohlíků pro recepci a usmívala se dřív, než se za ní zavřely dveře.</w:t>
+        <w:t>Joyce Wendtová přišla ve dvě hodiny s bílým papírovým pytlíkem housek pro recepci a usmívala se dřív, než se za ní zavřely dveře.</w:t>
       </w:r>
     </w:p>
     <w:p/>
@@ -6182,7 +6182,7 @@
     <w:p/>
     <w:p>
       <w:r>
-        <w:t>„Cokoliv můžu udělat,“ řekla a rozepínala si bundu. „Myslím to vážně. Přišla jsem jí pomoct. Snažím se jí pomáhat už dva týdny, kdyby mi to aspoň někdo dovolil.“ Odložila klíče na stůl vedle pytlíku – těžký mosazný a ocelový svazek, mezi nimiž nechyběl klíč od dodávky.</w:t>
+        <w:t>„Cokoliv můžu udělat,“ řekla a rozepínala si bundu. „Myslím to vážně. Přišla jsem jí pomoct. Snažím se jí pomáhat už dva týdny, kdyby mi to aspoň někdo dovolil.“ Odložila klíče na stůl vedle pytlíku – těžký svazek mosazných a ocelových klíčů, mezi nimiž nechyběl klíč od dodávky.</w:t>
       </w:r>
     </w:p>
     <w:p/>
@@ -6506,7 +6506,7 @@
     <w:p/>
     <w:p>
       <w:r>
-        <w:t>Papírový pytlík s rohlíky zůstal tam, kde ho nechala na rohu stolu.</w:t>
+        <w:t>Papírový pytlík s houskami zůstal tam, kde ho nechala na rohu stolu.</w:t>
       </w:r>
     </w:p>
     <w:p/>
@@ -6757,7 +6757,7 @@
     </w:p>
     <w:p>
       <w:r>
-        <w:t>„Ne.“ Sledovala jsem, jak se odlesky ohně mihotají na prázdném roštu. „Asi jsem doufala, že mi to trochu ulehčí. Neměla k tomu ale žádný důvod.“</w:t>
+        <w:t>„Ne.“ Sledovala jsem, jak se nad prázdným roštem převalují zlaté nitě. „Asi jsem doufala, že mi to trochu ulehčí. Neměla k tomu ale žádný důvod.“</w:t>
       </w:r>
     </w:p>
     <w:p>
@@ -6793,7 +6793,7 @@
     </w:p>
     <w:p>
       <w:r>
-        <w:t xml:space="preserve">Přišel stejným nenápadným způsobem, plochou koženou aktovkou v podpaží, ve stejném úředním kabátě. Ale u dveří Holly Jolly měl v kroku lehkost, jakou poprvé postrádal, byl to muž, který je projednou rád, že ho někam vyslali. Tanaková odnesla sklenici i křivou stížnost na okres a úředníci tam hned viděli, jak chytrou ruku s jejich papíry někdo měl, a uzly rozpletli uzel po uzlu. Předběžné opatření bylo zrušeno. Stejně se měl ten týden vrátit na opětovnou kontrolu. Díl k umyvadlu dorazil toho rána a Tom ho namontoval ještě před jeho příjezdem. Ta tři opotřebovaná místa v Gretině kuchyni byla přesně taková, jaké měla každá stará kuchyně na hlavní třídě, a nestály vůbec za řeč. Varney se zastavil v jejích dveřích a řekl jí to nahlas, před obchodem napůl plným lidí, kteří to přišli slyšet.</w:t>
+        <w:t xml:space="preserve">Přišel stejným nenápadným způsobem, plochou koženou aktovkou v podpaží, ve stejném úředním kabátě. Ale u dveří Holly Jolly měl v kroku lehkost, jakou poprvé postrádal, byl to muž, který je projednou rád, že ho někam vyslali. Tanaková odnesla sklenici i křivou stížnost na okres a úředníci tam hned prohlédli, co chytrá ruka s jejich papírem provedla, a uzly rozpletli uzel po uzlu. Předběžné opatření bylo zrušeno. Stejně se měl ten týden vrátit na opětovnou kontrolu. Díl k umyvadlu dorazil toho rána a Tom ho namontoval ještě před jeho příjezdem. Ta tři opotřebovaná místa v Gretině kuchyni byla přesně taková, jaké měla každá stará kuchyně na hlavní třídě, a nestála vůbec za řeč. Varney se zastavil v jejích dveřích a řekl jí to nahlas, před obchodem napůl plným lidí, kteří to přišli slyšet.</w:t>
       </w:r>
     </w:p>
     <w:p>
@@ -6813,7 +6813,7 @@
     </w:p>
     <w:p>
       <w:r>
-        <w:t xml:space="preserve">Rozneslo se to po Frost Falls do poledne tak rychle jako to podezření, jen tentokrát to hřálo. Nebyla to její mouka. Nikdy to nebyla její mouka. Byla to Joyce Wendtová odněkud z Bridgtonu, její bývalá společníčka, ta, co nosívala chléb do spolkového domu. Schválně tu mouku zkazila a lhala úřadům, aby ji přinutila zavřít, a paní Clausová jí na to přišla s tučňákem. Tahle poslední část během vyprávění tak trochu nabobtnala a já tomu nechala volný průběh. Než to dorazilo na samý konec Evergreen Avenue, předváděla Pip kousky, kterým bych sama stěží uvěřila.</w:t>
+        <w:t xml:space="preserve">Rozneslo se to po Frost Falls do poledne tak rychle jako to podezření, jen tentokrát to hřálo. Nebyla to její mouka. Nikdy to nebyla její mouka. Byla to Joyce Wendtová tam z Bridgtonu, její bývalá společníčka, ta, co nosívala chléb do spolkového domu. Schválně tu mouku zkazila a lhala úřadům, aby ji přinutila zavřít, a paní Clausová jí na to přišla s tučňákem. Tahle poslední část během vyprávění tak trochu nabobtnala a já tomu nechala volný průběh. Než to dorazilo na samý konec Evergreen Avenue, předváděla Pip kousky, kterým bych sama stěží uvěřila.</w:t>
       </w:r>
     </w:p>
     <w:p>
@@ -6835,7 +6835,7 @@
         <w:t xml:space="preserve"/>
       </w:r>
       <w:r>
-        <w:t xml:space="preserve"> pryč v půl třetí. Zázvorky mizely až na dno dózy. Ve tři hodiny zadělala na plech skořicových šneků, i když na to už bylo pozdě, a prodala každého jednoho horkého a bez polevy, ještě než stačily vychladnout.</w:t>
+        <w:t xml:space="preserve"> pryč v půl třetí. Zázvorky mizely až na dno dózy. Ve tři hodiny zadělala na plech skořicových šneků, i když na to už bylo pozdě, a prodala každého jednoho horkého a bez polevy, ještě než stačili vychladnout.</w:t>
       </w:r>
     </w:p>
     <w:p>
@@ -6865,7 +6865,7 @@
     </w:p>
     <w:p>
       <w:r>
-        <w:t>Vánoční kšefty, které se Joyce Wendtová pokusila odnést do Bridgtonu, dorazily Gretinými dveřmi dovnitř místo toho, a to během jediného odpoledne, rovnou do kasy ženy, kterou se je pokusila připravit o živobytí.</w:t>
+        <w:t>Vánoční kšefty, které se Joyce Wendtová pokusila odnést do Bridgtonu, dorazily Gretinými dveřmi dovnitř místo toho, a to během jediného odpoledne, rovnou do kasy ženy, kterou se o ně pokusila připravit.</w:t>
       </w:r>
     </w:p>
     <w:p>
@@ -6905,7 +6905,7 @@
     </w:p>
     <w:p>
       <w:r>
-        <w:t xml:space="preserve">Peteovi cukly rysy v obličeji a pak ztvrdly. Táž ruka ublížila kdysi i jemu, z opačného konce staré zášti. Přistoupil k vitríně, koupil si čokoládovo-pekanový koláč, který očividně vůbec nechtěl, a s řeznickou pečlivostí ho vstoje snědl u okna. Když do něj někdo za ním začal rýpat: „Tak co, Pete, o té nakládací rampě…“, Pete se otočil, podíval se na něj a ten muž si hned našel jinou zábavu.</w:t>
+        <w:t xml:space="preserve">Peteovi cukly rysy v obličeji a pak ztvrdly. Táž ruka ublížila i jemu, z opačného konce staré zášti. Přistoupil k vitríně, koupil si čokoládovo-pekanový koláč, který očividně vůbec nechtěl, a s řeznickou pečlivostí ho vstoje snědl u okna. Když do něj někdo za ním začal rýpat: „Tak co, Pete, o té nakládací rampě…“, Pete se otočil, podíval se na něj a ten muž si hned našel jinou zábavu.</w:t>
       </w:r>
     </w:p>
     <w:p>
@@ -6920,7 +6920,7 @@
     </w:p>
     <w:p>
       <w:r>
-        <w:t xml:space="preserve">Zatáhla mě za pokladnu, když fronta prořídla, do hřejivého kouta vzadu, kde tiše tikaly trouby, a ukázala mi zásuvku v kase. Nešla zavřít. „Podívej se na to,“ pronesla. Netriumfovala. Svoje úspory vložila do kvalitní mouky a dívala se, jak se jí jedna várka za druhou kazí, zatímco na vitríně ležel ten žlutý papír, a teď se na to dívala jen s němým úžasem. „Jediné odpoledne, Jessico. A k tomu ty peníze od soudu, dolar za dolar za to, co zkazila. Náčelnice mi přečetla tu částku, kterou budou požadovat.“ Opřela se do šuplíku dlaní a pak to vzdala. „Byla jsem v minusu. Nebudu předstírat, že nebyla. Proležela jsem noci vzhůru a počítala to, a město mi to vrátilo za jediné odpoledne a nikdo tomu neříkal charita. Říkali tomu pondělí.“ Podívala se skrz zamlžené sklo na frontu, která dál dupala v chladu na skořicové šneky, na jejichž další těsto už mezitím zadělávala.</w:t>
+        <w:t xml:space="preserve">Zatáhla mě za pokladnu, když fronta prořídla, do hřejivého kouta vzadu, kde tiše tikaly trouby, a ukázala mi zásuvku v kase. Nešla zavřít. „Podívej se na to,“ pronesla. Netriumfovala. Svoje úspory vložila do kvalitní mouky a dívala se, jak se jí jedna várka za druhou kazí, zatímco na vitríně ležel ten žlutý papír, a teď se na to dívala jen s němým úžasem. „Jediné odpoledne, Jessico. A k tomu ty peníze od soudu, dolar za dolar za to, co zkazila. Náčelnice mi přečetla tu částku, kterou budou požadovat.“ Opřela se do šuplíku dlaní a pak to vzdala. „Byla jsem v minusu. Nebudu předstírat, že ne. Proležela jsem noci vzhůru a počítala to, a město mi to vrátilo za jediné odpoledne a nikdo tomu neříkal charita. Říkali tomu pondělí.“ Podívala se skrz zamlžené sklo na frontu, která dál dupala v chladu na skořicové šneky, na jejichž další těsto už mezitím zadělávala.</w:t>
       </w:r>
     </w:p>
     <w:p>
@@ -7269,7 +7269,7 @@
     </w:p>
     <w:p>
       <w:r>
-        <w:t>„To teda ne,“ řekla jsem jí za pobavení celého města a vrátila rybu zpátky do kapsy. „Nikdo nestojí o storoční sardinku, ty nestydatý ptáku.“ S ublíženou důstojností nepochopené duše se zhroutila proti mé paži. Místnost se rozesmála, Emma nejvíc ze všech, a Pip to snášela.</w:t>
+        <w:t>„To teda ne,“ řekla jsem jí za pobavení celého města a vrátila rybu zpátky do kapsy. „Nikdo nestojí o storoční sardinku, ty nestydatý ptáku.“ S ublíženou důstojností nepochopené duše se mi uraženě uvelebila na paži. Místnost se rozesmála, Emma nejvíc ze všech, a Pip to snášela.</w:t>
       </w:r>
     </w:p>
     <w:p>
@@ -7423,13 +7423,13 @@
     <w:p/>
     <w:p>
       <w:r>
-        <w:t xml:space="preserve">„Znám tu ženu už čtyřicet let,“ pronesla. „Patnáct z nich jsme spolu stávaly u tohohle stolu a přísahala bych, že znám každý myšlenkový pochod v její hlavě. A ona si pak sedla k mému pultu s brýlemi na čtení a opisovala si mé zákazníky z mé knihy.“ Odložila nůž. „Mám jí vůbec odpovědět? Ptám se sama sebe hned, jak jsem roztopila pece, a odpověď pořád nemám.“</w:t>
-      </w:r>
-    </w:p>
-    <w:p/>
-    <w:p>
-      <w:r>
-        <w:t>Od chvíle, kdy Joyce odešla, si obě ženy vyměnily jen dopis od právníka, který Greta roztrhala, a stížnost odeslanou na okres. Nic z toho nic nenarovnalo.</w:t>
+        <w:t xml:space="preserve">„Znám tu ženu už čtyřicet let,“ pronesla. „Patnáct z nich jsme spolu stávaly u tohohle stolu a přísahala bych, že znám každý myšlenkový pochod v její hlavě. A ona si pak sedla k mému pultu s brýlemi na čtení a opisovala si mé zákazníky z mé knihy.“ Odložila nůž. „Mám jí vůbec odpovědět? Ptám se sama sebe od chvíle, kdy jsem roztopila pece, a odpověď pořád nemám.“</w:t>
+      </w:r>
+    </w:p>
+    <w:p/>
+    <w:p>
+      <w:r>
+        <w:t>Od chvíle, kdy Joyce odešla, si obě ženy vyměnily jen dopis od právníka, který Greta roztrhala, a na stroji psanou stížnost odeslanou na okres. Nic z toho nic nenarovnalo.</w:t>
       </w:r>
     </w:p>
     <w:p/>

</xml_diff>